<commit_message>
docs(qms): Excel registers EM26-19…22 approved (AR-2026-003)
Alexander Peter (review), Sheryl Nazareth (QA) and Anita Johan (Managing Director)
confirmed the four registers on 2026-10-12. Approval record:
docs/qms/records/approvals/2026-10-12_AR-2026-003_register_approval.md

- EM26-19…22: status APPROVED, signatures dated 2026-10-12
- Also reviewed with them: gap analysis 8.2 / 9.1.2 re-rating, REG-01 entries, evidence README
- REG-01, QM-01 and the README point to AR-2026-003

Co-Authored-By: Claude Opus 5.5 <noreply@anthropic.com>
</commit_message>
<xml_diff>
--- a/docs/qms/evidence-2026/QMS_Word/registers__REG-01_Document_Control_Register.docx
+++ b/docs/qms/evidence-2026/QMS_Word/registers__REG-01_Document_Control_Register.docx
@@ -6034,10 +6034,10 @@
         </w:tblCellMar>
       </w:tblPr>
       <w:tblGrid>
-        <w:gridCol w:w="741"/>
-        <w:gridCol w:w="2976"/>
-        <w:gridCol w:w="2411"/>
-        <w:gridCol w:w="5211"/>
+        <w:gridCol w:w="739"/>
+        <w:gridCol w:w="2938"/>
+        <w:gridCol w:w="2384"/>
+        <w:gridCol w:w="5278"/>
       </w:tblGrid>
       <w:tr>
         <w:trPr>
@@ -6045,7 +6045,7 @@
         </w:trPr>
         <w:tc>
           <w:tcPr>
-            <w:tcW w:w="741" w:type="dxa"/>
+            <w:tcW w:w="739" w:type="dxa"/>
             <w:tcBorders>
               <w:top w:val="single" w:sz="6" w:space="0" w:color="BFC7D5"/>
               <w:left w:val="single" w:sz="6" w:space="0" w:color="BFC7D5"/>
@@ -6075,7 +6075,7 @@
         </w:tc>
         <w:tc>
           <w:tcPr>
-            <w:tcW w:w="2976" w:type="dxa"/>
+            <w:tcW w:w="2938" w:type="dxa"/>
             <w:tcBorders>
               <w:top w:val="single" w:sz="6" w:space="0" w:color="BFC7D5"/>
               <w:left w:val="single" w:sz="2" w:space="0" w:color="BFC7D5"/>
@@ -6105,7 +6105,7 @@
         </w:tc>
         <w:tc>
           <w:tcPr>
-            <w:tcW w:w="2411" w:type="dxa"/>
+            <w:tcW w:w="2384" w:type="dxa"/>
             <w:tcBorders>
               <w:top w:val="single" w:sz="6" w:space="0" w:color="BFC7D5"/>
               <w:left w:val="single" w:sz="2" w:space="0" w:color="BFC7D5"/>
@@ -6135,7 +6135,7 @@
         </w:tc>
         <w:tc>
           <w:tcPr>
-            <w:tcW w:w="5211" w:type="dxa"/>
+            <w:tcW w:w="5278" w:type="dxa"/>
             <w:tcBorders>
               <w:top w:val="single" w:sz="6" w:space="0" w:color="BFC7D5"/>
               <w:left w:val="single" w:sz="2" w:space="0" w:color="BFC7D5"/>
@@ -6168,7 +6168,7 @@
         <w:trPr/>
         <w:tc>
           <w:tcPr>
-            <w:tcW w:w="741" w:type="dxa"/>
+            <w:tcW w:w="739" w:type="dxa"/>
             <w:tcBorders>
               <w:left w:val="single" w:sz="6" w:space="0" w:color="BFC7D5"/>
               <w:bottom w:val="single" w:sz="2" w:space="0" w:color="BFC7D5"/>
@@ -6192,7 +6192,7 @@
         </w:tc>
         <w:tc>
           <w:tcPr>
-            <w:tcW w:w="2976" w:type="dxa"/>
+            <w:tcW w:w="2938" w:type="dxa"/>
             <w:tcBorders>
               <w:left w:val="single" w:sz="2" w:space="0" w:color="BFC7D5"/>
               <w:bottom w:val="single" w:sz="2" w:space="0" w:color="BFC7D5"/>
@@ -6216,7 +6216,7 @@
         </w:tc>
         <w:tc>
           <w:tcPr>
-            <w:tcW w:w="2411" w:type="dxa"/>
+            <w:tcW w:w="2384" w:type="dxa"/>
             <w:tcBorders>
               <w:left w:val="single" w:sz="2" w:space="0" w:color="BFC7D5"/>
               <w:bottom w:val="single" w:sz="2" w:space="0" w:color="BFC7D5"/>
@@ -6240,7 +6240,7 @@
         </w:tc>
         <w:tc>
           <w:tcPr>
-            <w:tcW w:w="5211" w:type="dxa"/>
+            <w:tcW w:w="5278" w:type="dxa"/>
             <w:tcBorders>
               <w:left w:val="single" w:sz="2" w:space="0" w:color="BFC7D5"/>
               <w:bottom w:val="single" w:sz="2" w:space="0" w:color="BFC7D5"/>
@@ -6267,7 +6267,7 @@
         <w:trPr/>
         <w:tc>
           <w:tcPr>
-            <w:tcW w:w="741" w:type="dxa"/>
+            <w:tcW w:w="739" w:type="dxa"/>
             <w:tcBorders>
               <w:left w:val="single" w:sz="6" w:space="0" w:color="BFC7D5"/>
               <w:bottom w:val="single" w:sz="2" w:space="0" w:color="BFC7D5"/>
@@ -6291,7 +6291,7 @@
         </w:tc>
         <w:tc>
           <w:tcPr>
-            <w:tcW w:w="2976" w:type="dxa"/>
+            <w:tcW w:w="2938" w:type="dxa"/>
             <w:tcBorders>
               <w:left w:val="single" w:sz="2" w:space="0" w:color="BFC7D5"/>
               <w:bottom w:val="single" w:sz="2" w:space="0" w:color="BFC7D5"/>
@@ -6315,7 +6315,7 @@
         </w:tc>
         <w:tc>
           <w:tcPr>
-            <w:tcW w:w="2411" w:type="dxa"/>
+            <w:tcW w:w="2384" w:type="dxa"/>
             <w:tcBorders>
               <w:left w:val="single" w:sz="2" w:space="0" w:color="BFC7D5"/>
               <w:bottom w:val="single" w:sz="2" w:space="0" w:color="BFC7D5"/>
@@ -6339,7 +6339,7 @@
         </w:tc>
         <w:tc>
           <w:tcPr>
-            <w:tcW w:w="5211" w:type="dxa"/>
+            <w:tcW w:w="5278" w:type="dxa"/>
             <w:tcBorders>
               <w:left w:val="single" w:sz="2" w:space="0" w:color="BFC7D5"/>
               <w:bottom w:val="single" w:sz="2" w:space="0" w:color="BFC7D5"/>
@@ -6376,7 +6376,7 @@
         <w:trPr/>
         <w:tc>
           <w:tcPr>
-            <w:tcW w:w="741" w:type="dxa"/>
+            <w:tcW w:w="739" w:type="dxa"/>
             <w:tcBorders>
               <w:left w:val="single" w:sz="6" w:space="0" w:color="BFC7D5"/>
               <w:bottom w:val="single" w:sz="2" w:space="0" w:color="BFC7D5"/>
@@ -6400,7 +6400,7 @@
         </w:tc>
         <w:tc>
           <w:tcPr>
-            <w:tcW w:w="2976" w:type="dxa"/>
+            <w:tcW w:w="2938" w:type="dxa"/>
             <w:tcBorders>
               <w:left w:val="single" w:sz="2" w:space="0" w:color="BFC7D5"/>
               <w:bottom w:val="single" w:sz="2" w:space="0" w:color="BFC7D5"/>
@@ -6424,7 +6424,7 @@
         </w:tc>
         <w:tc>
           <w:tcPr>
-            <w:tcW w:w="2411" w:type="dxa"/>
+            <w:tcW w:w="2384" w:type="dxa"/>
             <w:tcBorders>
               <w:left w:val="single" w:sz="2" w:space="0" w:color="BFC7D5"/>
               <w:bottom w:val="single" w:sz="2" w:space="0" w:color="BFC7D5"/>
@@ -6448,7 +6448,7 @@
         </w:tc>
         <w:tc>
           <w:tcPr>
-            <w:tcW w:w="5211" w:type="dxa"/>
+            <w:tcW w:w="5278" w:type="dxa"/>
             <w:tcBorders>
               <w:left w:val="single" w:sz="2" w:space="0" w:color="BFC7D5"/>
               <w:bottom w:val="single" w:sz="2" w:space="0" w:color="BFC7D5"/>
@@ -6475,7 +6475,7 @@
         <w:trPr/>
         <w:tc>
           <w:tcPr>
-            <w:tcW w:w="741" w:type="dxa"/>
+            <w:tcW w:w="739" w:type="dxa"/>
             <w:tcBorders>
               <w:left w:val="single" w:sz="6" w:space="0" w:color="BFC7D5"/>
               <w:bottom w:val="single" w:sz="2" w:space="0" w:color="BFC7D5"/>
@@ -6499,7 +6499,7 @@
         </w:tc>
         <w:tc>
           <w:tcPr>
-            <w:tcW w:w="2976" w:type="dxa"/>
+            <w:tcW w:w="2938" w:type="dxa"/>
             <w:tcBorders>
               <w:left w:val="single" w:sz="2" w:space="0" w:color="BFC7D5"/>
               <w:bottom w:val="single" w:sz="2" w:space="0" w:color="BFC7D5"/>
@@ -6523,7 +6523,7 @@
         </w:tc>
         <w:tc>
           <w:tcPr>
-            <w:tcW w:w="2411" w:type="dxa"/>
+            <w:tcW w:w="2384" w:type="dxa"/>
             <w:tcBorders>
               <w:left w:val="single" w:sz="2" w:space="0" w:color="BFC7D5"/>
               <w:bottom w:val="single" w:sz="2" w:space="0" w:color="BFC7D5"/>
@@ -6547,7 +6547,7 @@
         </w:tc>
         <w:tc>
           <w:tcPr>
-            <w:tcW w:w="5211" w:type="dxa"/>
+            <w:tcW w:w="5278" w:type="dxa"/>
             <w:tcBorders>
               <w:left w:val="single" w:sz="2" w:space="0" w:color="BFC7D5"/>
               <w:bottom w:val="single" w:sz="2" w:space="0" w:color="BFC7D5"/>
@@ -6574,7 +6574,7 @@
         <w:trPr/>
         <w:tc>
           <w:tcPr>
-            <w:tcW w:w="741" w:type="dxa"/>
+            <w:tcW w:w="739" w:type="dxa"/>
             <w:tcBorders>
               <w:left w:val="single" w:sz="6" w:space="0" w:color="BFC7D5"/>
               <w:bottom w:val="single" w:sz="2" w:space="0" w:color="BFC7D5"/>
@@ -6598,7 +6598,7 @@
         </w:tc>
         <w:tc>
           <w:tcPr>
-            <w:tcW w:w="2976" w:type="dxa"/>
+            <w:tcW w:w="2938" w:type="dxa"/>
             <w:tcBorders>
               <w:left w:val="single" w:sz="2" w:space="0" w:color="BFC7D5"/>
               <w:bottom w:val="single" w:sz="2" w:space="0" w:color="BFC7D5"/>
@@ -6622,7 +6622,7 @@
         </w:tc>
         <w:tc>
           <w:tcPr>
-            <w:tcW w:w="2411" w:type="dxa"/>
+            <w:tcW w:w="2384" w:type="dxa"/>
             <w:tcBorders>
               <w:left w:val="single" w:sz="2" w:space="0" w:color="BFC7D5"/>
               <w:bottom w:val="single" w:sz="2" w:space="0" w:color="BFC7D5"/>
@@ -6646,7 +6646,7 @@
         </w:tc>
         <w:tc>
           <w:tcPr>
-            <w:tcW w:w="5211" w:type="dxa"/>
+            <w:tcW w:w="5278" w:type="dxa"/>
             <w:tcBorders>
               <w:left w:val="single" w:sz="2" w:space="0" w:color="BFC7D5"/>
               <w:bottom w:val="single" w:sz="2" w:space="0" w:color="BFC7D5"/>
@@ -6673,7 +6673,7 @@
         <w:trPr/>
         <w:tc>
           <w:tcPr>
-            <w:tcW w:w="741" w:type="dxa"/>
+            <w:tcW w:w="739" w:type="dxa"/>
             <w:tcBorders>
               <w:left w:val="single" w:sz="6" w:space="0" w:color="BFC7D5"/>
               <w:bottom w:val="single" w:sz="2" w:space="0" w:color="BFC7D5"/>
@@ -6697,7 +6697,7 @@
         </w:tc>
         <w:tc>
           <w:tcPr>
-            <w:tcW w:w="2976" w:type="dxa"/>
+            <w:tcW w:w="2938" w:type="dxa"/>
             <w:tcBorders>
               <w:left w:val="single" w:sz="2" w:space="0" w:color="BFC7D5"/>
               <w:bottom w:val="single" w:sz="2" w:space="0" w:color="BFC7D5"/>
@@ -6721,7 +6721,7 @@
         </w:tc>
         <w:tc>
           <w:tcPr>
-            <w:tcW w:w="2411" w:type="dxa"/>
+            <w:tcW w:w="2384" w:type="dxa"/>
             <w:tcBorders>
               <w:left w:val="single" w:sz="2" w:space="0" w:color="BFC7D5"/>
               <w:bottom w:val="single" w:sz="2" w:space="0" w:color="BFC7D5"/>
@@ -6745,7 +6745,7 @@
         </w:tc>
         <w:tc>
           <w:tcPr>
-            <w:tcW w:w="5211" w:type="dxa"/>
+            <w:tcW w:w="5278" w:type="dxa"/>
             <w:tcBorders>
               <w:left w:val="single" w:sz="2" w:space="0" w:color="BFC7D5"/>
               <w:bottom w:val="single" w:sz="2" w:space="0" w:color="BFC7D5"/>
@@ -6772,7 +6772,7 @@
         <w:trPr/>
         <w:tc>
           <w:tcPr>
-            <w:tcW w:w="741" w:type="dxa"/>
+            <w:tcW w:w="739" w:type="dxa"/>
             <w:tcBorders>
               <w:left w:val="single" w:sz="6" w:space="0" w:color="BFC7D5"/>
               <w:bottom w:val="single" w:sz="2" w:space="0" w:color="BFC7D5"/>
@@ -6796,7 +6796,7 @@
         </w:tc>
         <w:tc>
           <w:tcPr>
-            <w:tcW w:w="2976" w:type="dxa"/>
+            <w:tcW w:w="2938" w:type="dxa"/>
             <w:tcBorders>
               <w:left w:val="single" w:sz="2" w:space="0" w:color="BFC7D5"/>
               <w:bottom w:val="single" w:sz="2" w:space="0" w:color="BFC7D5"/>
@@ -6820,7 +6820,7 @@
         </w:tc>
         <w:tc>
           <w:tcPr>
-            <w:tcW w:w="2411" w:type="dxa"/>
+            <w:tcW w:w="2384" w:type="dxa"/>
             <w:tcBorders>
               <w:left w:val="single" w:sz="2" w:space="0" w:color="BFC7D5"/>
               <w:bottom w:val="single" w:sz="2" w:space="0" w:color="BFC7D5"/>
@@ -6844,7 +6844,7 @@
         </w:tc>
         <w:tc>
           <w:tcPr>
-            <w:tcW w:w="5211" w:type="dxa"/>
+            <w:tcW w:w="5278" w:type="dxa"/>
             <w:tcBorders>
               <w:left w:val="single" w:sz="2" w:space="0" w:color="BFC7D5"/>
               <w:bottom w:val="single" w:sz="2" w:space="0" w:color="BFC7D5"/>
@@ -6871,7 +6871,7 @@
         <w:trPr/>
         <w:tc>
           <w:tcPr>
-            <w:tcW w:w="741" w:type="dxa"/>
+            <w:tcW w:w="739" w:type="dxa"/>
             <w:tcBorders>
               <w:left w:val="single" w:sz="6" w:space="0" w:color="BFC7D5"/>
               <w:bottom w:val="single" w:sz="2" w:space="0" w:color="BFC7D5"/>
@@ -6895,7 +6895,7 @@
         </w:tc>
         <w:tc>
           <w:tcPr>
-            <w:tcW w:w="2976" w:type="dxa"/>
+            <w:tcW w:w="2938" w:type="dxa"/>
             <w:tcBorders>
               <w:left w:val="single" w:sz="2" w:space="0" w:color="BFC7D5"/>
               <w:bottom w:val="single" w:sz="2" w:space="0" w:color="BFC7D5"/>
@@ -6919,7 +6919,7 @@
         </w:tc>
         <w:tc>
           <w:tcPr>
-            <w:tcW w:w="2411" w:type="dxa"/>
+            <w:tcW w:w="2384" w:type="dxa"/>
             <w:tcBorders>
               <w:left w:val="single" w:sz="2" w:space="0" w:color="BFC7D5"/>
               <w:bottom w:val="single" w:sz="2" w:space="0" w:color="BFC7D5"/>
@@ -6943,7 +6943,7 @@
         </w:tc>
         <w:tc>
           <w:tcPr>
-            <w:tcW w:w="5211" w:type="dxa"/>
+            <w:tcW w:w="5278" w:type="dxa"/>
             <w:tcBorders>
               <w:left w:val="single" w:sz="2" w:space="0" w:color="BFC7D5"/>
               <w:bottom w:val="single" w:sz="2" w:space="0" w:color="BFC7D5"/>
@@ -6970,7 +6970,7 @@
         <w:trPr/>
         <w:tc>
           <w:tcPr>
-            <w:tcW w:w="741" w:type="dxa"/>
+            <w:tcW w:w="739" w:type="dxa"/>
             <w:tcBorders>
               <w:left w:val="single" w:sz="6" w:space="0" w:color="BFC7D5"/>
               <w:bottom w:val="single" w:sz="2" w:space="0" w:color="BFC7D5"/>
@@ -6994,7 +6994,7 @@
         </w:tc>
         <w:tc>
           <w:tcPr>
-            <w:tcW w:w="2976" w:type="dxa"/>
+            <w:tcW w:w="2938" w:type="dxa"/>
             <w:tcBorders>
               <w:left w:val="single" w:sz="2" w:space="0" w:color="BFC7D5"/>
               <w:bottom w:val="single" w:sz="2" w:space="0" w:color="BFC7D5"/>
@@ -7018,7 +7018,7 @@
         </w:tc>
         <w:tc>
           <w:tcPr>
-            <w:tcW w:w="2411" w:type="dxa"/>
+            <w:tcW w:w="2384" w:type="dxa"/>
             <w:tcBorders>
               <w:left w:val="single" w:sz="2" w:space="0" w:color="BFC7D5"/>
               <w:bottom w:val="single" w:sz="2" w:space="0" w:color="BFC7D5"/>
@@ -7042,7 +7042,7 @@
         </w:tc>
         <w:tc>
           <w:tcPr>
-            <w:tcW w:w="5211" w:type="dxa"/>
+            <w:tcW w:w="5278" w:type="dxa"/>
             <w:tcBorders>
               <w:left w:val="single" w:sz="2" w:space="0" w:color="BFC7D5"/>
               <w:bottom w:val="single" w:sz="2" w:space="0" w:color="BFC7D5"/>
@@ -7069,7 +7069,7 @@
         <w:trPr/>
         <w:tc>
           <w:tcPr>
-            <w:tcW w:w="741" w:type="dxa"/>
+            <w:tcW w:w="739" w:type="dxa"/>
             <w:tcBorders>
               <w:left w:val="single" w:sz="6" w:space="0" w:color="BFC7D5"/>
               <w:bottom w:val="single" w:sz="2" w:space="0" w:color="BFC7D5"/>
@@ -7093,7 +7093,7 @@
         </w:tc>
         <w:tc>
           <w:tcPr>
-            <w:tcW w:w="2976" w:type="dxa"/>
+            <w:tcW w:w="2938" w:type="dxa"/>
             <w:tcBorders>
               <w:left w:val="single" w:sz="2" w:space="0" w:color="BFC7D5"/>
               <w:bottom w:val="single" w:sz="2" w:space="0" w:color="BFC7D5"/>
@@ -7117,7 +7117,7 @@
         </w:tc>
         <w:tc>
           <w:tcPr>
-            <w:tcW w:w="2411" w:type="dxa"/>
+            <w:tcW w:w="2384" w:type="dxa"/>
             <w:tcBorders>
               <w:left w:val="single" w:sz="2" w:space="0" w:color="BFC7D5"/>
               <w:bottom w:val="single" w:sz="2" w:space="0" w:color="BFC7D5"/>
@@ -7141,7 +7141,7 @@
         </w:tc>
         <w:tc>
           <w:tcPr>
-            <w:tcW w:w="5211" w:type="dxa"/>
+            <w:tcW w:w="5278" w:type="dxa"/>
             <w:tcBorders>
               <w:left w:val="single" w:sz="2" w:space="0" w:color="BFC7D5"/>
               <w:bottom w:val="single" w:sz="2" w:space="0" w:color="BFC7D5"/>
@@ -7168,7 +7168,7 @@
         <w:trPr/>
         <w:tc>
           <w:tcPr>
-            <w:tcW w:w="741" w:type="dxa"/>
+            <w:tcW w:w="739" w:type="dxa"/>
             <w:tcBorders>
               <w:left w:val="single" w:sz="6" w:space="0" w:color="BFC7D5"/>
               <w:bottom w:val="single" w:sz="2" w:space="0" w:color="BFC7D5"/>
@@ -7192,7 +7192,7 @@
         </w:tc>
         <w:tc>
           <w:tcPr>
-            <w:tcW w:w="2976" w:type="dxa"/>
+            <w:tcW w:w="2938" w:type="dxa"/>
             <w:tcBorders>
               <w:left w:val="single" w:sz="2" w:space="0" w:color="BFC7D5"/>
               <w:bottom w:val="single" w:sz="2" w:space="0" w:color="BFC7D5"/>
@@ -7216,7 +7216,7 @@
         </w:tc>
         <w:tc>
           <w:tcPr>
-            <w:tcW w:w="2411" w:type="dxa"/>
+            <w:tcW w:w="2384" w:type="dxa"/>
             <w:tcBorders>
               <w:left w:val="single" w:sz="2" w:space="0" w:color="BFC7D5"/>
               <w:bottom w:val="single" w:sz="2" w:space="0" w:color="BFC7D5"/>
@@ -7240,25 +7240,25 @@
         </w:tc>
         <w:tc>
           <w:tcPr>
-            <w:tcW w:w="5211" w:type="dxa"/>
-            <w:tcBorders>
-              <w:left w:val="single" w:sz="2" w:space="0" w:color="BFC7D5"/>
-              <w:bottom w:val="single" w:sz="2" w:space="0" w:color="BFC7D5"/>
-              <w:right w:val="single" w:sz="6" w:space="0" w:color="BFC7D5"/>
-            </w:tcBorders>
-            <w:vAlign w:val="center"/>
-          </w:tcPr>
-          <w:p>
-            <w:pPr>
-              <w:pStyle w:val="TableContents"/>
-              <w:bidi w:val="0"/>
-              <w:spacing w:before="0" w:after="283"/>
-              <w:jc w:val="left"/>
-              <w:rPr/>
-            </w:pPr>
-            <w:r>
-              <w:rPr/>
-              <w:t xml:space="preserve">33 reviews (15 in 2025, 18 in 2026), 75 actions, 66 closed; issued 2026-10-11 for approval — </w:t>
+            <w:tcW w:w="5278" w:type="dxa"/>
+            <w:tcBorders>
+              <w:left w:val="single" w:sz="2" w:space="0" w:color="BFC7D5"/>
+              <w:bottom w:val="single" w:sz="2" w:space="0" w:color="BFC7D5"/>
+              <w:right w:val="single" w:sz="6" w:space="0" w:color="BFC7D5"/>
+            </w:tcBorders>
+            <w:vAlign w:val="center"/>
+          </w:tcPr>
+          <w:p>
+            <w:pPr>
+              <w:pStyle w:val="TableContents"/>
+              <w:bidi w:val="0"/>
+              <w:spacing w:before="0" w:after="283"/>
+              <w:jc w:val="left"/>
+              <w:rPr/>
+            </w:pPr>
+            <w:r>
+              <w:rPr/>
+              <w:t xml:space="preserve">33 reviews (15 in 2025, 18 in 2026), 75 actions, 66 closed; approved 2026-10-12 (AR-2026-003) — </w:t>
             </w:r>
             <w:r>
               <w:rPr>
@@ -7273,7 +7273,7 @@
         <w:trPr/>
         <w:tc>
           <w:tcPr>
-            <w:tcW w:w="741" w:type="dxa"/>
+            <w:tcW w:w="739" w:type="dxa"/>
             <w:tcBorders>
               <w:left w:val="single" w:sz="6" w:space="0" w:color="BFC7D5"/>
               <w:bottom w:val="single" w:sz="2" w:space="0" w:color="BFC7D5"/>
@@ -7297,7 +7297,7 @@
         </w:tc>
         <w:tc>
           <w:tcPr>
-            <w:tcW w:w="2976" w:type="dxa"/>
+            <w:tcW w:w="2938" w:type="dxa"/>
             <w:tcBorders>
               <w:left w:val="single" w:sz="2" w:space="0" w:color="BFC7D5"/>
               <w:bottom w:val="single" w:sz="2" w:space="0" w:color="BFC7D5"/>
@@ -7321,7 +7321,7 @@
         </w:tc>
         <w:tc>
           <w:tcPr>
-            <w:tcW w:w="2411" w:type="dxa"/>
+            <w:tcW w:w="2384" w:type="dxa"/>
             <w:tcBorders>
               <w:left w:val="single" w:sz="2" w:space="0" w:color="BFC7D5"/>
               <w:bottom w:val="single" w:sz="2" w:space="0" w:color="BFC7D5"/>
@@ -7345,25 +7345,25 @@
         </w:tc>
         <w:tc>
           <w:tcPr>
-            <w:tcW w:w="5211" w:type="dxa"/>
-            <w:tcBorders>
-              <w:left w:val="single" w:sz="2" w:space="0" w:color="BFC7D5"/>
-              <w:bottom w:val="single" w:sz="2" w:space="0" w:color="BFC7D5"/>
-              <w:right w:val="single" w:sz="6" w:space="0" w:color="BFC7D5"/>
-            </w:tcBorders>
-            <w:vAlign w:val="center"/>
-          </w:tcPr>
-          <w:p>
-            <w:pPr>
-              <w:pStyle w:val="TableContents"/>
-              <w:bidi w:val="0"/>
-              <w:spacing w:before="0" w:after="283"/>
-              <w:jc w:val="left"/>
-              <w:rPr/>
-            </w:pPr>
-            <w:r>
-              <w:rPr/>
-              <w:t>39 requirements (5 from 2025, 34 in 2026) with traceability; issued 2026-10-11 for approval</w:t>
+            <w:tcW w:w="5278" w:type="dxa"/>
+            <w:tcBorders>
+              <w:left w:val="single" w:sz="2" w:space="0" w:color="BFC7D5"/>
+              <w:bottom w:val="single" w:sz="2" w:space="0" w:color="BFC7D5"/>
+              <w:right w:val="single" w:sz="6" w:space="0" w:color="BFC7D5"/>
+            </w:tcBorders>
+            <w:vAlign w:val="center"/>
+          </w:tcPr>
+          <w:p>
+            <w:pPr>
+              <w:pStyle w:val="TableContents"/>
+              <w:bidi w:val="0"/>
+              <w:spacing w:before="0" w:after="283"/>
+              <w:jc w:val="left"/>
+              <w:rPr/>
+            </w:pPr>
+            <w:r>
+              <w:rPr/>
+              <w:t>39 requirements (5 from 2025, 34 in 2026) with traceability; approved 2026-10-12 (AR-2026-003)</w:t>
             </w:r>
           </w:p>
         </w:tc>
@@ -7372,7 +7372,7 @@
         <w:trPr/>
         <w:tc>
           <w:tcPr>
-            <w:tcW w:w="741" w:type="dxa"/>
+            <w:tcW w:w="739" w:type="dxa"/>
             <w:tcBorders>
               <w:left w:val="single" w:sz="6" w:space="0" w:color="BFC7D5"/>
               <w:bottom w:val="single" w:sz="2" w:space="0" w:color="BFC7D5"/>
@@ -7396,7 +7396,7 @@
         </w:tc>
         <w:tc>
           <w:tcPr>
-            <w:tcW w:w="2976" w:type="dxa"/>
+            <w:tcW w:w="2938" w:type="dxa"/>
             <w:tcBorders>
               <w:left w:val="single" w:sz="2" w:space="0" w:color="BFC7D5"/>
               <w:bottom w:val="single" w:sz="2" w:space="0" w:color="BFC7D5"/>
@@ -7420,7 +7420,7 @@
         </w:tc>
         <w:tc>
           <w:tcPr>
-            <w:tcW w:w="2411" w:type="dxa"/>
+            <w:tcW w:w="2384" w:type="dxa"/>
             <w:tcBorders>
               <w:left w:val="single" w:sz="2" w:space="0" w:color="BFC7D5"/>
               <w:bottom w:val="single" w:sz="2" w:space="0" w:color="BFC7D5"/>
@@ -7444,25 +7444,25 @@
         </w:tc>
         <w:tc>
           <w:tcPr>
-            <w:tcW w:w="5211" w:type="dxa"/>
-            <w:tcBorders>
-              <w:left w:val="single" w:sz="2" w:space="0" w:color="BFC7D5"/>
-              <w:bottom w:val="single" w:sz="2" w:space="0" w:color="BFC7D5"/>
-              <w:right w:val="single" w:sz="6" w:space="0" w:color="BFC7D5"/>
-            </w:tcBorders>
-            <w:vAlign w:val="center"/>
-          </w:tcPr>
-          <w:p>
-            <w:pPr>
-              <w:pStyle w:val="TableContents"/>
-              <w:bidi w:val="0"/>
-              <w:spacing w:before="0" w:after="283"/>
-              <w:jc w:val="left"/>
-              <w:rPr/>
-            </w:pPr>
-            <w:r>
-              <w:rPr/>
-              <w:t>31 NFRs + 9 from 2025, measurement history; issued 2026-10-11 for approval</w:t>
+            <w:tcW w:w="5278" w:type="dxa"/>
+            <w:tcBorders>
+              <w:left w:val="single" w:sz="2" w:space="0" w:color="BFC7D5"/>
+              <w:bottom w:val="single" w:sz="2" w:space="0" w:color="BFC7D5"/>
+              <w:right w:val="single" w:sz="6" w:space="0" w:color="BFC7D5"/>
+            </w:tcBorders>
+            <w:vAlign w:val="center"/>
+          </w:tcPr>
+          <w:p>
+            <w:pPr>
+              <w:pStyle w:val="TableContents"/>
+              <w:bidi w:val="0"/>
+              <w:spacing w:before="0" w:after="283"/>
+              <w:jc w:val="left"/>
+              <w:rPr/>
+            </w:pPr>
+            <w:r>
+              <w:rPr/>
+              <w:t>31 NFRs + 9 from 2025, measurement history; approved 2026-10-12 (AR-2026-003)</w:t>
             </w:r>
           </w:p>
         </w:tc>
@@ -7471,7 +7471,7 @@
         <w:trPr/>
         <w:tc>
           <w:tcPr>
-            <w:tcW w:w="741" w:type="dxa"/>
+            <w:tcW w:w="739" w:type="dxa"/>
             <w:tcBorders>
               <w:left w:val="single" w:sz="6" w:space="0" w:color="BFC7D5"/>
               <w:bottom w:val="single" w:sz="6" w:space="0" w:color="BFC7D5"/>
@@ -7495,7 +7495,7 @@
         </w:tc>
         <w:tc>
           <w:tcPr>
-            <w:tcW w:w="2976" w:type="dxa"/>
+            <w:tcW w:w="2938" w:type="dxa"/>
             <w:tcBorders>
               <w:left w:val="single" w:sz="2" w:space="0" w:color="BFC7D5"/>
               <w:bottom w:val="single" w:sz="6" w:space="0" w:color="BFC7D5"/>
@@ -7519,7 +7519,7 @@
         </w:tc>
         <w:tc>
           <w:tcPr>
-            <w:tcW w:w="2411" w:type="dxa"/>
+            <w:tcW w:w="2384" w:type="dxa"/>
             <w:tcBorders>
               <w:left w:val="single" w:sz="2" w:space="0" w:color="BFC7D5"/>
               <w:bottom w:val="single" w:sz="6" w:space="0" w:color="BFC7D5"/>
@@ -7543,7 +7543,7 @@
         </w:tc>
         <w:tc>
           <w:tcPr>
-            <w:tcW w:w="5211" w:type="dxa"/>
+            <w:tcW w:w="5278" w:type="dxa"/>
             <w:tcBorders>
               <w:left w:val="single" w:sz="2" w:space="0" w:color="BFC7D5"/>
               <w:bottom w:val="single" w:sz="6" w:space="0" w:color="BFC7D5"/>
@@ -7561,7 +7561,7 @@
             </w:pPr>
             <w:r>
               <w:rPr/>
-              <w:t>2025 plan vs actual, 2026 increments, forward plan; issued 2026-10-11 for approval</w:t>
+              <w:t>2025 plan vs actual, 2026 increments, forward plan; approved 2026-10-12 (AR-2026-003)</w:t>
             </w:r>
           </w:p>
         </w:tc>
@@ -8186,7 +8186,7 @@
       </w:pPr>
       <w:r>
         <w:rPr/>
-        <w:t xml:space="preserve">At 2026-10-10: </w:t>
+        <w:t xml:space="preserve">At 2026-10-12: </w:t>
       </w:r>
       <w:r>
         <w:rPr>
@@ -8196,7 +8196,7 @@
       </w:r>
       <w:r>
         <w:rPr/>
-        <w:t xml:space="preserve"> (AR-2026-001, AR-2026-002), </w:t>
+        <w:t xml:space="preserve"> (AR-2026-001, AR-2026-002, AR-2026-003), </w:t>
       </w:r>
       <w:r>
         <w:rPr>

</xml_diff>

<commit_message>
docs(qms): revision 1.1 of the Excel registers approved (AR-2026-004) — versions v1.0.0 → v1.4.1
Alexander Peter (review), Sheryl Nazareth (QA) and Anita Johan (Managing Director)
confirmed revision 1.1 on 2026-10-12. Approval record:
docs/qms/records/approvals/2026-10-12_AR-2026-004_register_revision_approval.md

- EM26-19…22 rev 1.1: status APPROVED, signatures dated 2026-10-12
- REG-01, QM-01 and the evidence README point to AR-2026-004

Co-Authored-By: Claude Opus 5.5 <noreply@anthropic.com>
</commit_message>
<xml_diff>
--- a/docs/qms/evidence-2026/QMS_Word/registers__REG-01_Document_Control_Register.docx
+++ b/docs/qms/evidence-2026/QMS_Word/registers__REG-01_Document_Control_Register.docx
@@ -6035,9 +6035,9 @@
       </w:tblPr>
       <w:tblGrid>
         <w:gridCol w:w="720"/>
-        <w:gridCol w:w="2542"/>
-        <w:gridCol w:w="2108"/>
-        <w:gridCol w:w="5969"/>
+        <w:gridCol w:w="2525"/>
+        <w:gridCol w:w="2096"/>
+        <w:gridCol w:w="5998"/>
       </w:tblGrid>
       <w:tr>
         <w:trPr>
@@ -6075,7 +6075,7 @@
         </w:tc>
         <w:tc>
           <w:tcPr>
-            <w:tcW w:w="2542" w:type="dxa"/>
+            <w:tcW w:w="2525" w:type="dxa"/>
             <w:tcBorders>
               <w:top w:val="single" w:sz="6" w:space="0" w:color="BFC7D5"/>
               <w:left w:val="single" w:sz="2" w:space="0" w:color="BFC7D5"/>
@@ -6105,7 +6105,7 @@
         </w:tc>
         <w:tc>
           <w:tcPr>
-            <w:tcW w:w="2108" w:type="dxa"/>
+            <w:tcW w:w="2096" w:type="dxa"/>
             <w:tcBorders>
               <w:top w:val="single" w:sz="6" w:space="0" w:color="BFC7D5"/>
               <w:left w:val="single" w:sz="2" w:space="0" w:color="BFC7D5"/>
@@ -6135,7 +6135,7 @@
         </w:tc>
         <w:tc>
           <w:tcPr>
-            <w:tcW w:w="5969" w:type="dxa"/>
+            <w:tcW w:w="5998" w:type="dxa"/>
             <w:tcBorders>
               <w:top w:val="single" w:sz="6" w:space="0" w:color="BFC7D5"/>
               <w:left w:val="single" w:sz="2" w:space="0" w:color="BFC7D5"/>
@@ -6192,7 +6192,7 @@
         </w:tc>
         <w:tc>
           <w:tcPr>
-            <w:tcW w:w="2542" w:type="dxa"/>
+            <w:tcW w:w="2525" w:type="dxa"/>
             <w:tcBorders>
               <w:left w:val="single" w:sz="2" w:space="0" w:color="BFC7D5"/>
               <w:bottom w:val="single" w:sz="2" w:space="0" w:color="BFC7D5"/>
@@ -6216,7 +6216,7 @@
         </w:tc>
         <w:tc>
           <w:tcPr>
-            <w:tcW w:w="2108" w:type="dxa"/>
+            <w:tcW w:w="2096" w:type="dxa"/>
             <w:tcBorders>
               <w:left w:val="single" w:sz="2" w:space="0" w:color="BFC7D5"/>
               <w:bottom w:val="single" w:sz="2" w:space="0" w:color="BFC7D5"/>
@@ -6240,7 +6240,7 @@
         </w:tc>
         <w:tc>
           <w:tcPr>
-            <w:tcW w:w="5969" w:type="dxa"/>
+            <w:tcW w:w="5998" w:type="dxa"/>
             <w:tcBorders>
               <w:left w:val="single" w:sz="2" w:space="0" w:color="BFC7D5"/>
               <w:bottom w:val="single" w:sz="2" w:space="0" w:color="BFC7D5"/>
@@ -6291,7 +6291,7 @@
         </w:tc>
         <w:tc>
           <w:tcPr>
-            <w:tcW w:w="2542" w:type="dxa"/>
+            <w:tcW w:w="2525" w:type="dxa"/>
             <w:tcBorders>
               <w:left w:val="single" w:sz="2" w:space="0" w:color="BFC7D5"/>
               <w:bottom w:val="single" w:sz="2" w:space="0" w:color="BFC7D5"/>
@@ -6315,7 +6315,7 @@
         </w:tc>
         <w:tc>
           <w:tcPr>
-            <w:tcW w:w="2108" w:type="dxa"/>
+            <w:tcW w:w="2096" w:type="dxa"/>
             <w:tcBorders>
               <w:left w:val="single" w:sz="2" w:space="0" w:color="BFC7D5"/>
               <w:bottom w:val="single" w:sz="2" w:space="0" w:color="BFC7D5"/>
@@ -6339,7 +6339,7 @@
         </w:tc>
         <w:tc>
           <w:tcPr>
-            <w:tcW w:w="5969" w:type="dxa"/>
+            <w:tcW w:w="5998" w:type="dxa"/>
             <w:tcBorders>
               <w:left w:val="single" w:sz="2" w:space="0" w:color="BFC7D5"/>
               <w:bottom w:val="single" w:sz="2" w:space="0" w:color="BFC7D5"/>
@@ -6400,7 +6400,7 @@
         </w:tc>
         <w:tc>
           <w:tcPr>
-            <w:tcW w:w="2542" w:type="dxa"/>
+            <w:tcW w:w="2525" w:type="dxa"/>
             <w:tcBorders>
               <w:left w:val="single" w:sz="2" w:space="0" w:color="BFC7D5"/>
               <w:bottom w:val="single" w:sz="2" w:space="0" w:color="BFC7D5"/>
@@ -6424,7 +6424,7 @@
         </w:tc>
         <w:tc>
           <w:tcPr>
-            <w:tcW w:w="2108" w:type="dxa"/>
+            <w:tcW w:w="2096" w:type="dxa"/>
             <w:tcBorders>
               <w:left w:val="single" w:sz="2" w:space="0" w:color="BFC7D5"/>
               <w:bottom w:val="single" w:sz="2" w:space="0" w:color="BFC7D5"/>
@@ -6448,7 +6448,7 @@
         </w:tc>
         <w:tc>
           <w:tcPr>
-            <w:tcW w:w="5969" w:type="dxa"/>
+            <w:tcW w:w="5998" w:type="dxa"/>
             <w:tcBorders>
               <w:left w:val="single" w:sz="2" w:space="0" w:color="BFC7D5"/>
               <w:bottom w:val="single" w:sz="2" w:space="0" w:color="BFC7D5"/>
@@ -6499,7 +6499,7 @@
         </w:tc>
         <w:tc>
           <w:tcPr>
-            <w:tcW w:w="2542" w:type="dxa"/>
+            <w:tcW w:w="2525" w:type="dxa"/>
             <w:tcBorders>
               <w:left w:val="single" w:sz="2" w:space="0" w:color="BFC7D5"/>
               <w:bottom w:val="single" w:sz="2" w:space="0" w:color="BFC7D5"/>
@@ -6523,7 +6523,7 @@
         </w:tc>
         <w:tc>
           <w:tcPr>
-            <w:tcW w:w="2108" w:type="dxa"/>
+            <w:tcW w:w="2096" w:type="dxa"/>
             <w:tcBorders>
               <w:left w:val="single" w:sz="2" w:space="0" w:color="BFC7D5"/>
               <w:bottom w:val="single" w:sz="2" w:space="0" w:color="BFC7D5"/>
@@ -6547,7 +6547,7 @@
         </w:tc>
         <w:tc>
           <w:tcPr>
-            <w:tcW w:w="5969" w:type="dxa"/>
+            <w:tcW w:w="5998" w:type="dxa"/>
             <w:tcBorders>
               <w:left w:val="single" w:sz="2" w:space="0" w:color="BFC7D5"/>
               <w:bottom w:val="single" w:sz="2" w:space="0" w:color="BFC7D5"/>
@@ -6598,7 +6598,7 @@
         </w:tc>
         <w:tc>
           <w:tcPr>
-            <w:tcW w:w="2542" w:type="dxa"/>
+            <w:tcW w:w="2525" w:type="dxa"/>
             <w:tcBorders>
               <w:left w:val="single" w:sz="2" w:space="0" w:color="BFC7D5"/>
               <w:bottom w:val="single" w:sz="2" w:space="0" w:color="BFC7D5"/>
@@ -6622,7 +6622,7 @@
         </w:tc>
         <w:tc>
           <w:tcPr>
-            <w:tcW w:w="2108" w:type="dxa"/>
+            <w:tcW w:w="2096" w:type="dxa"/>
             <w:tcBorders>
               <w:left w:val="single" w:sz="2" w:space="0" w:color="BFC7D5"/>
               <w:bottom w:val="single" w:sz="2" w:space="0" w:color="BFC7D5"/>
@@ -6646,7 +6646,7 @@
         </w:tc>
         <w:tc>
           <w:tcPr>
-            <w:tcW w:w="5969" w:type="dxa"/>
+            <w:tcW w:w="5998" w:type="dxa"/>
             <w:tcBorders>
               <w:left w:val="single" w:sz="2" w:space="0" w:color="BFC7D5"/>
               <w:bottom w:val="single" w:sz="2" w:space="0" w:color="BFC7D5"/>
@@ -6697,7 +6697,7 @@
         </w:tc>
         <w:tc>
           <w:tcPr>
-            <w:tcW w:w="2542" w:type="dxa"/>
+            <w:tcW w:w="2525" w:type="dxa"/>
             <w:tcBorders>
               <w:left w:val="single" w:sz="2" w:space="0" w:color="BFC7D5"/>
               <w:bottom w:val="single" w:sz="2" w:space="0" w:color="BFC7D5"/>
@@ -6721,7 +6721,7 @@
         </w:tc>
         <w:tc>
           <w:tcPr>
-            <w:tcW w:w="2108" w:type="dxa"/>
+            <w:tcW w:w="2096" w:type="dxa"/>
             <w:tcBorders>
               <w:left w:val="single" w:sz="2" w:space="0" w:color="BFC7D5"/>
               <w:bottom w:val="single" w:sz="2" w:space="0" w:color="BFC7D5"/>
@@ -6745,7 +6745,7 @@
         </w:tc>
         <w:tc>
           <w:tcPr>
-            <w:tcW w:w="5969" w:type="dxa"/>
+            <w:tcW w:w="5998" w:type="dxa"/>
             <w:tcBorders>
               <w:left w:val="single" w:sz="2" w:space="0" w:color="BFC7D5"/>
               <w:bottom w:val="single" w:sz="2" w:space="0" w:color="BFC7D5"/>
@@ -6796,7 +6796,7 @@
         </w:tc>
         <w:tc>
           <w:tcPr>
-            <w:tcW w:w="2542" w:type="dxa"/>
+            <w:tcW w:w="2525" w:type="dxa"/>
             <w:tcBorders>
               <w:left w:val="single" w:sz="2" w:space="0" w:color="BFC7D5"/>
               <w:bottom w:val="single" w:sz="2" w:space="0" w:color="BFC7D5"/>
@@ -6820,7 +6820,7 @@
         </w:tc>
         <w:tc>
           <w:tcPr>
-            <w:tcW w:w="2108" w:type="dxa"/>
+            <w:tcW w:w="2096" w:type="dxa"/>
             <w:tcBorders>
               <w:left w:val="single" w:sz="2" w:space="0" w:color="BFC7D5"/>
               <w:bottom w:val="single" w:sz="2" w:space="0" w:color="BFC7D5"/>
@@ -6844,7 +6844,7 @@
         </w:tc>
         <w:tc>
           <w:tcPr>
-            <w:tcW w:w="5969" w:type="dxa"/>
+            <w:tcW w:w="5998" w:type="dxa"/>
             <w:tcBorders>
               <w:left w:val="single" w:sz="2" w:space="0" w:color="BFC7D5"/>
               <w:bottom w:val="single" w:sz="2" w:space="0" w:color="BFC7D5"/>
@@ -6895,7 +6895,7 @@
         </w:tc>
         <w:tc>
           <w:tcPr>
-            <w:tcW w:w="2542" w:type="dxa"/>
+            <w:tcW w:w="2525" w:type="dxa"/>
             <w:tcBorders>
               <w:left w:val="single" w:sz="2" w:space="0" w:color="BFC7D5"/>
               <w:bottom w:val="single" w:sz="2" w:space="0" w:color="BFC7D5"/>
@@ -6919,7 +6919,7 @@
         </w:tc>
         <w:tc>
           <w:tcPr>
-            <w:tcW w:w="2108" w:type="dxa"/>
+            <w:tcW w:w="2096" w:type="dxa"/>
             <w:tcBorders>
               <w:left w:val="single" w:sz="2" w:space="0" w:color="BFC7D5"/>
               <w:bottom w:val="single" w:sz="2" w:space="0" w:color="BFC7D5"/>
@@ -6943,7 +6943,7 @@
         </w:tc>
         <w:tc>
           <w:tcPr>
-            <w:tcW w:w="5969" w:type="dxa"/>
+            <w:tcW w:w="5998" w:type="dxa"/>
             <w:tcBorders>
               <w:left w:val="single" w:sz="2" w:space="0" w:color="BFC7D5"/>
               <w:bottom w:val="single" w:sz="2" w:space="0" w:color="BFC7D5"/>
@@ -6994,7 +6994,7 @@
         </w:tc>
         <w:tc>
           <w:tcPr>
-            <w:tcW w:w="2542" w:type="dxa"/>
+            <w:tcW w:w="2525" w:type="dxa"/>
             <w:tcBorders>
               <w:left w:val="single" w:sz="2" w:space="0" w:color="BFC7D5"/>
               <w:bottom w:val="single" w:sz="2" w:space="0" w:color="BFC7D5"/>
@@ -7018,7 +7018,7 @@
         </w:tc>
         <w:tc>
           <w:tcPr>
-            <w:tcW w:w="2108" w:type="dxa"/>
+            <w:tcW w:w="2096" w:type="dxa"/>
             <w:tcBorders>
               <w:left w:val="single" w:sz="2" w:space="0" w:color="BFC7D5"/>
               <w:bottom w:val="single" w:sz="2" w:space="0" w:color="BFC7D5"/>
@@ -7042,7 +7042,7 @@
         </w:tc>
         <w:tc>
           <w:tcPr>
-            <w:tcW w:w="5969" w:type="dxa"/>
+            <w:tcW w:w="5998" w:type="dxa"/>
             <w:tcBorders>
               <w:left w:val="single" w:sz="2" w:space="0" w:color="BFC7D5"/>
               <w:bottom w:val="single" w:sz="2" w:space="0" w:color="BFC7D5"/>
@@ -7093,7 +7093,7 @@
         </w:tc>
         <w:tc>
           <w:tcPr>
-            <w:tcW w:w="2542" w:type="dxa"/>
+            <w:tcW w:w="2525" w:type="dxa"/>
             <w:tcBorders>
               <w:left w:val="single" w:sz="2" w:space="0" w:color="BFC7D5"/>
               <w:bottom w:val="single" w:sz="2" w:space="0" w:color="BFC7D5"/>
@@ -7117,7 +7117,7 @@
         </w:tc>
         <w:tc>
           <w:tcPr>
-            <w:tcW w:w="2108" w:type="dxa"/>
+            <w:tcW w:w="2096" w:type="dxa"/>
             <w:tcBorders>
               <w:left w:val="single" w:sz="2" w:space="0" w:color="BFC7D5"/>
               <w:bottom w:val="single" w:sz="2" w:space="0" w:color="BFC7D5"/>
@@ -7141,7 +7141,7 @@
         </w:tc>
         <w:tc>
           <w:tcPr>
-            <w:tcW w:w="5969" w:type="dxa"/>
+            <w:tcW w:w="5998" w:type="dxa"/>
             <w:tcBorders>
               <w:left w:val="single" w:sz="2" w:space="0" w:color="BFC7D5"/>
               <w:bottom w:val="single" w:sz="2" w:space="0" w:color="BFC7D5"/>
@@ -7192,7 +7192,7 @@
         </w:tc>
         <w:tc>
           <w:tcPr>
-            <w:tcW w:w="2542" w:type="dxa"/>
+            <w:tcW w:w="2525" w:type="dxa"/>
             <w:tcBorders>
               <w:left w:val="single" w:sz="2" w:space="0" w:color="BFC7D5"/>
               <w:bottom w:val="single" w:sz="2" w:space="0" w:color="BFC7D5"/>
@@ -7216,7 +7216,7 @@
         </w:tc>
         <w:tc>
           <w:tcPr>
-            <w:tcW w:w="2108" w:type="dxa"/>
+            <w:tcW w:w="2096" w:type="dxa"/>
             <w:tcBorders>
               <w:left w:val="single" w:sz="2" w:space="0" w:color="BFC7D5"/>
               <w:bottom w:val="single" w:sz="2" w:space="0" w:color="BFC7D5"/>
@@ -7240,25 +7240,25 @@
         </w:tc>
         <w:tc>
           <w:tcPr>
-            <w:tcW w:w="5969" w:type="dxa"/>
-            <w:tcBorders>
-              <w:left w:val="single" w:sz="2" w:space="0" w:color="BFC7D5"/>
-              <w:bottom w:val="single" w:sz="2" w:space="0" w:color="BFC7D5"/>
-              <w:right w:val="single" w:sz="6" w:space="0" w:color="BFC7D5"/>
-            </w:tcBorders>
-            <w:vAlign w:val="center"/>
-          </w:tcPr>
-          <w:p>
-            <w:pPr>
-              <w:pStyle w:val="TableContents"/>
-              <w:bidi w:val="0"/>
-              <w:spacing w:before="0" w:after="283"/>
-              <w:jc w:val="left"/>
-              <w:rPr/>
-            </w:pPr>
-            <w:r>
-              <w:rPr/>
-              <w:t xml:space="preserve">33 reviews (15 in 2025, 18 in 2026), 75 actions, 66 closed; rev 1.0 approved 2026-10-12 (AR-2026-003); rev 1.1 adds versions v1.0.0–v1.4.1 — approval to be confirmed — </w:t>
+            <w:tcW w:w="5998" w:type="dxa"/>
+            <w:tcBorders>
+              <w:left w:val="single" w:sz="2" w:space="0" w:color="BFC7D5"/>
+              <w:bottom w:val="single" w:sz="2" w:space="0" w:color="BFC7D5"/>
+              <w:right w:val="single" w:sz="6" w:space="0" w:color="BFC7D5"/>
+            </w:tcBorders>
+            <w:vAlign w:val="center"/>
+          </w:tcPr>
+          <w:p>
+            <w:pPr>
+              <w:pStyle w:val="TableContents"/>
+              <w:bidi w:val="0"/>
+              <w:spacing w:before="0" w:after="283"/>
+              <w:jc w:val="left"/>
+              <w:rPr/>
+            </w:pPr>
+            <w:r>
+              <w:rPr/>
+              <w:t xml:space="preserve">33 reviews (15 in 2025, 18 in 2026), 75 actions, 66 closed; rev 1.0 approved 2026-10-12 (AR-2026-003); rev 1.1 (versions v1.0.0–v1.4.1) approved 2026-10-12 (AR-2026-004) — </w:t>
             </w:r>
             <w:r>
               <w:rPr>
@@ -7297,7 +7297,7 @@
         </w:tc>
         <w:tc>
           <w:tcPr>
-            <w:tcW w:w="2542" w:type="dxa"/>
+            <w:tcW w:w="2525" w:type="dxa"/>
             <w:tcBorders>
               <w:left w:val="single" w:sz="2" w:space="0" w:color="BFC7D5"/>
               <w:bottom w:val="single" w:sz="2" w:space="0" w:color="BFC7D5"/>
@@ -7321,7 +7321,7 @@
         </w:tc>
         <w:tc>
           <w:tcPr>
-            <w:tcW w:w="2108" w:type="dxa"/>
+            <w:tcW w:w="2096" w:type="dxa"/>
             <w:tcBorders>
               <w:left w:val="single" w:sz="2" w:space="0" w:color="BFC7D5"/>
               <w:bottom w:val="single" w:sz="2" w:space="0" w:color="BFC7D5"/>
@@ -7345,25 +7345,25 @@
         </w:tc>
         <w:tc>
           <w:tcPr>
-            <w:tcW w:w="5969" w:type="dxa"/>
-            <w:tcBorders>
-              <w:left w:val="single" w:sz="2" w:space="0" w:color="BFC7D5"/>
-              <w:bottom w:val="single" w:sz="2" w:space="0" w:color="BFC7D5"/>
-              <w:right w:val="single" w:sz="6" w:space="0" w:color="BFC7D5"/>
-            </w:tcBorders>
-            <w:vAlign w:val="center"/>
-          </w:tcPr>
-          <w:p>
-            <w:pPr>
-              <w:pStyle w:val="TableContents"/>
-              <w:bidi w:val="0"/>
-              <w:spacing w:before="0" w:after="283"/>
-              <w:jc w:val="left"/>
-              <w:rPr/>
-            </w:pPr>
-            <w:r>
-              <w:rPr/>
-              <w:t>39 requirements (5 from 2025, 34 in 2026) with traceability; rev 1.0 approved 2026-10-12 (AR-2026-003); rev 1.1 adds versions v1.0.0–v1.4.1 — approval to be confirmed</w:t>
+            <w:tcW w:w="5998" w:type="dxa"/>
+            <w:tcBorders>
+              <w:left w:val="single" w:sz="2" w:space="0" w:color="BFC7D5"/>
+              <w:bottom w:val="single" w:sz="2" w:space="0" w:color="BFC7D5"/>
+              <w:right w:val="single" w:sz="6" w:space="0" w:color="BFC7D5"/>
+            </w:tcBorders>
+            <w:vAlign w:val="center"/>
+          </w:tcPr>
+          <w:p>
+            <w:pPr>
+              <w:pStyle w:val="TableContents"/>
+              <w:bidi w:val="0"/>
+              <w:spacing w:before="0" w:after="283"/>
+              <w:jc w:val="left"/>
+              <w:rPr/>
+            </w:pPr>
+            <w:r>
+              <w:rPr/>
+              <w:t>39 requirements (5 from 2025, 34 in 2026) with traceability; rev 1.0 approved 2026-10-12 (AR-2026-003); rev 1.1 (versions v1.0.0–v1.4.1) approved 2026-10-12 (AR-2026-004)</w:t>
             </w:r>
           </w:p>
         </w:tc>
@@ -7396,7 +7396,7 @@
         </w:tc>
         <w:tc>
           <w:tcPr>
-            <w:tcW w:w="2542" w:type="dxa"/>
+            <w:tcW w:w="2525" w:type="dxa"/>
             <w:tcBorders>
               <w:left w:val="single" w:sz="2" w:space="0" w:color="BFC7D5"/>
               <w:bottom w:val="single" w:sz="2" w:space="0" w:color="BFC7D5"/>
@@ -7420,7 +7420,7 @@
         </w:tc>
         <w:tc>
           <w:tcPr>
-            <w:tcW w:w="2108" w:type="dxa"/>
+            <w:tcW w:w="2096" w:type="dxa"/>
             <w:tcBorders>
               <w:left w:val="single" w:sz="2" w:space="0" w:color="BFC7D5"/>
               <w:bottom w:val="single" w:sz="2" w:space="0" w:color="BFC7D5"/>
@@ -7444,25 +7444,25 @@
         </w:tc>
         <w:tc>
           <w:tcPr>
-            <w:tcW w:w="5969" w:type="dxa"/>
-            <w:tcBorders>
-              <w:left w:val="single" w:sz="2" w:space="0" w:color="BFC7D5"/>
-              <w:bottom w:val="single" w:sz="2" w:space="0" w:color="BFC7D5"/>
-              <w:right w:val="single" w:sz="6" w:space="0" w:color="BFC7D5"/>
-            </w:tcBorders>
-            <w:vAlign w:val="center"/>
-          </w:tcPr>
-          <w:p>
-            <w:pPr>
-              <w:pStyle w:val="TableContents"/>
-              <w:bidi w:val="0"/>
-              <w:spacing w:before="0" w:after="283"/>
-              <w:jc w:val="left"/>
-              <w:rPr/>
-            </w:pPr>
-            <w:r>
-              <w:rPr/>
-              <w:t>31 NFRs + 9 from 2025, measurement history; rev 1.0 approved 2026-10-12 (AR-2026-003); rev 1.1 adds versions v1.0.0–v1.4.1 — approval to be confirmed</w:t>
+            <w:tcW w:w="5998" w:type="dxa"/>
+            <w:tcBorders>
+              <w:left w:val="single" w:sz="2" w:space="0" w:color="BFC7D5"/>
+              <w:bottom w:val="single" w:sz="2" w:space="0" w:color="BFC7D5"/>
+              <w:right w:val="single" w:sz="6" w:space="0" w:color="BFC7D5"/>
+            </w:tcBorders>
+            <w:vAlign w:val="center"/>
+          </w:tcPr>
+          <w:p>
+            <w:pPr>
+              <w:pStyle w:val="TableContents"/>
+              <w:bidi w:val="0"/>
+              <w:spacing w:before="0" w:after="283"/>
+              <w:jc w:val="left"/>
+              <w:rPr/>
+            </w:pPr>
+            <w:r>
+              <w:rPr/>
+              <w:t>31 NFRs + 9 from 2025, measurement history; rev 1.0 approved 2026-10-12 (AR-2026-003); rev 1.1 (versions v1.0.0–v1.4.1) approved 2026-10-12 (AR-2026-004)</w:t>
             </w:r>
           </w:p>
         </w:tc>
@@ -7495,7 +7495,7 @@
         </w:tc>
         <w:tc>
           <w:tcPr>
-            <w:tcW w:w="2542" w:type="dxa"/>
+            <w:tcW w:w="2525" w:type="dxa"/>
             <w:tcBorders>
               <w:left w:val="single" w:sz="2" w:space="0" w:color="BFC7D5"/>
               <w:bottom w:val="single" w:sz="6" w:space="0" w:color="BFC7D5"/>
@@ -7519,7 +7519,7 @@
         </w:tc>
         <w:tc>
           <w:tcPr>
-            <w:tcW w:w="2108" w:type="dxa"/>
+            <w:tcW w:w="2096" w:type="dxa"/>
             <w:tcBorders>
               <w:left w:val="single" w:sz="2" w:space="0" w:color="BFC7D5"/>
               <w:bottom w:val="single" w:sz="6" w:space="0" w:color="BFC7D5"/>
@@ -7543,7 +7543,7 @@
         </w:tc>
         <w:tc>
           <w:tcPr>
-            <w:tcW w:w="5969" w:type="dxa"/>
+            <w:tcW w:w="5998" w:type="dxa"/>
             <w:tcBorders>
               <w:left w:val="single" w:sz="2" w:space="0" w:color="BFC7D5"/>
               <w:bottom w:val="single" w:sz="6" w:space="0" w:color="BFC7D5"/>
@@ -7561,7 +7561,7 @@
             </w:pPr>
             <w:r>
               <w:rPr/>
-              <w:t>2025 plan vs actual, 2026 increments, forward plan; rev 1.0 approved 2026-10-12 (AR-2026-003); rev 1.1 adds versions v1.0.0–v1.4.1 — approval to be confirmed</w:t>
+              <w:t>2025 plan vs actual, 2026 increments, forward plan; rev 1.0 approved 2026-10-12 (AR-2026-003); rev 1.1 (versions v1.0.0–v1.4.1) approved 2026-10-12 (AR-2026-004)</w:t>
             </w:r>
           </w:p>
         </w:tc>
@@ -8196,7 +8196,7 @@
       </w:r>
       <w:r>
         <w:rPr/>
-        <w:t xml:space="preserve"> (AR-2026-001, AR-2026-002, AR-2026-003), </w:t>
+        <w:t xml:space="preserve"> (AR-2026-001 … AR-2026-004), </w:t>
       </w:r>
       <w:r>
         <w:rPr>

</xml_diff>

<commit_message>
docs: audit pack for the 14 Oct 2026 session (Project 2 — software development for university) and AR-2026-005
One folder per agenda item — contract review, project plan, communication with
client, requirements, changes to requirements, design and development, review
records, test plan and test cases, test reports, identification and traceability,
release notes, lessons learnt, new EchoMind use case — each split into the 2025
university project and 2026 EchoMind Enterprise, with a session plan and an
evidence index.

New documents, approved 2026-10-13 (AR-2026-005): EM26-23 Project Plan, EM26-24
Test Plan, EM26-25 Release Notes v1.0.0 → v1.4.1, EM26-26 New Use Cases,
EM26-27 Client Communication Log. REG-01 and QM-01 updated.

Public copy: clients as Client A–D; the 2025 originals (which name the 2025
customer) are held in the controlled copy and listed in the evidence index.

Co-Authored-By: Claude Opus 5.5 <noreply@anthropic.com>
</commit_message>
<xml_diff>
--- a/docs/qms/evidence-2026/QMS_Word/registers__REG-01_Document_Control_Register.docx
+++ b/docs/qms/evidence-2026/QMS_Word/registers__REG-01_Document_Control_Register.docx
@@ -6034,10 +6034,10 @@
         </w:tblCellMar>
       </w:tblPr>
       <w:tblGrid>
-        <w:gridCol w:w="720"/>
-        <w:gridCol w:w="2525"/>
-        <w:gridCol w:w="2096"/>
-        <w:gridCol w:w="5998"/>
+        <w:gridCol w:w="718"/>
+        <w:gridCol w:w="2512"/>
+        <w:gridCol w:w="2072"/>
+        <w:gridCol w:w="6037"/>
       </w:tblGrid>
       <w:tr>
         <w:trPr>
@@ -6045,7 +6045,7 @@
         </w:trPr>
         <w:tc>
           <w:tcPr>
-            <w:tcW w:w="720" w:type="dxa"/>
+            <w:tcW w:w="718" w:type="dxa"/>
             <w:tcBorders>
               <w:top w:val="single" w:sz="6" w:space="0" w:color="BFC7D5"/>
               <w:left w:val="single" w:sz="6" w:space="0" w:color="BFC7D5"/>
@@ -6075,7 +6075,7 @@
         </w:tc>
         <w:tc>
           <w:tcPr>
-            <w:tcW w:w="2525" w:type="dxa"/>
+            <w:tcW w:w="2512" w:type="dxa"/>
             <w:tcBorders>
               <w:top w:val="single" w:sz="6" w:space="0" w:color="BFC7D5"/>
               <w:left w:val="single" w:sz="2" w:space="0" w:color="BFC7D5"/>
@@ -6105,7 +6105,7 @@
         </w:tc>
         <w:tc>
           <w:tcPr>
-            <w:tcW w:w="2096" w:type="dxa"/>
+            <w:tcW w:w="2072" w:type="dxa"/>
             <w:tcBorders>
               <w:top w:val="single" w:sz="6" w:space="0" w:color="BFC7D5"/>
               <w:left w:val="single" w:sz="2" w:space="0" w:color="BFC7D5"/>
@@ -6135,7 +6135,7 @@
         </w:tc>
         <w:tc>
           <w:tcPr>
-            <w:tcW w:w="5998" w:type="dxa"/>
+            <w:tcW w:w="6037" w:type="dxa"/>
             <w:tcBorders>
               <w:top w:val="single" w:sz="6" w:space="0" w:color="BFC7D5"/>
               <w:left w:val="single" w:sz="2" w:space="0" w:color="BFC7D5"/>
@@ -6168,7 +6168,7 @@
         <w:trPr/>
         <w:tc>
           <w:tcPr>
-            <w:tcW w:w="720" w:type="dxa"/>
+            <w:tcW w:w="718" w:type="dxa"/>
             <w:tcBorders>
               <w:left w:val="single" w:sz="6" w:space="0" w:color="BFC7D5"/>
               <w:bottom w:val="single" w:sz="2" w:space="0" w:color="BFC7D5"/>
@@ -6192,7 +6192,7 @@
         </w:tc>
         <w:tc>
           <w:tcPr>
-            <w:tcW w:w="2525" w:type="dxa"/>
+            <w:tcW w:w="2512" w:type="dxa"/>
             <w:tcBorders>
               <w:left w:val="single" w:sz="2" w:space="0" w:color="BFC7D5"/>
               <w:bottom w:val="single" w:sz="2" w:space="0" w:color="BFC7D5"/>
@@ -6216,7 +6216,7 @@
         </w:tc>
         <w:tc>
           <w:tcPr>
-            <w:tcW w:w="2096" w:type="dxa"/>
+            <w:tcW w:w="2072" w:type="dxa"/>
             <w:tcBorders>
               <w:left w:val="single" w:sz="2" w:space="0" w:color="BFC7D5"/>
               <w:bottom w:val="single" w:sz="2" w:space="0" w:color="BFC7D5"/>
@@ -6240,7 +6240,7 @@
         </w:tc>
         <w:tc>
           <w:tcPr>
-            <w:tcW w:w="5998" w:type="dxa"/>
+            <w:tcW w:w="6037" w:type="dxa"/>
             <w:tcBorders>
               <w:left w:val="single" w:sz="2" w:space="0" w:color="BFC7D5"/>
               <w:bottom w:val="single" w:sz="2" w:space="0" w:color="BFC7D5"/>
@@ -6267,7 +6267,7 @@
         <w:trPr/>
         <w:tc>
           <w:tcPr>
-            <w:tcW w:w="720" w:type="dxa"/>
+            <w:tcW w:w="718" w:type="dxa"/>
             <w:tcBorders>
               <w:left w:val="single" w:sz="6" w:space="0" w:color="BFC7D5"/>
               <w:bottom w:val="single" w:sz="2" w:space="0" w:color="BFC7D5"/>
@@ -6291,7 +6291,7 @@
         </w:tc>
         <w:tc>
           <w:tcPr>
-            <w:tcW w:w="2525" w:type="dxa"/>
+            <w:tcW w:w="2512" w:type="dxa"/>
             <w:tcBorders>
               <w:left w:val="single" w:sz="2" w:space="0" w:color="BFC7D5"/>
               <w:bottom w:val="single" w:sz="2" w:space="0" w:color="BFC7D5"/>
@@ -6315,7 +6315,7 @@
         </w:tc>
         <w:tc>
           <w:tcPr>
-            <w:tcW w:w="2096" w:type="dxa"/>
+            <w:tcW w:w="2072" w:type="dxa"/>
             <w:tcBorders>
               <w:left w:val="single" w:sz="2" w:space="0" w:color="BFC7D5"/>
               <w:bottom w:val="single" w:sz="2" w:space="0" w:color="BFC7D5"/>
@@ -6339,7 +6339,7 @@
         </w:tc>
         <w:tc>
           <w:tcPr>
-            <w:tcW w:w="5998" w:type="dxa"/>
+            <w:tcW w:w="6037" w:type="dxa"/>
             <w:tcBorders>
               <w:left w:val="single" w:sz="2" w:space="0" w:color="BFC7D5"/>
               <w:bottom w:val="single" w:sz="2" w:space="0" w:color="BFC7D5"/>
@@ -6376,7 +6376,7 @@
         <w:trPr/>
         <w:tc>
           <w:tcPr>
-            <w:tcW w:w="720" w:type="dxa"/>
+            <w:tcW w:w="718" w:type="dxa"/>
             <w:tcBorders>
               <w:left w:val="single" w:sz="6" w:space="0" w:color="BFC7D5"/>
               <w:bottom w:val="single" w:sz="2" w:space="0" w:color="BFC7D5"/>
@@ -6400,7 +6400,7 @@
         </w:tc>
         <w:tc>
           <w:tcPr>
-            <w:tcW w:w="2525" w:type="dxa"/>
+            <w:tcW w:w="2512" w:type="dxa"/>
             <w:tcBorders>
               <w:left w:val="single" w:sz="2" w:space="0" w:color="BFC7D5"/>
               <w:bottom w:val="single" w:sz="2" w:space="0" w:color="BFC7D5"/>
@@ -6424,7 +6424,7 @@
         </w:tc>
         <w:tc>
           <w:tcPr>
-            <w:tcW w:w="2096" w:type="dxa"/>
+            <w:tcW w:w="2072" w:type="dxa"/>
             <w:tcBorders>
               <w:left w:val="single" w:sz="2" w:space="0" w:color="BFC7D5"/>
               <w:bottom w:val="single" w:sz="2" w:space="0" w:color="BFC7D5"/>
@@ -6448,7 +6448,7 @@
         </w:tc>
         <w:tc>
           <w:tcPr>
-            <w:tcW w:w="5998" w:type="dxa"/>
+            <w:tcW w:w="6037" w:type="dxa"/>
             <w:tcBorders>
               <w:left w:val="single" w:sz="2" w:space="0" w:color="BFC7D5"/>
               <w:bottom w:val="single" w:sz="2" w:space="0" w:color="BFC7D5"/>
@@ -6475,7 +6475,7 @@
         <w:trPr/>
         <w:tc>
           <w:tcPr>
-            <w:tcW w:w="720" w:type="dxa"/>
+            <w:tcW w:w="718" w:type="dxa"/>
             <w:tcBorders>
               <w:left w:val="single" w:sz="6" w:space="0" w:color="BFC7D5"/>
               <w:bottom w:val="single" w:sz="2" w:space="0" w:color="BFC7D5"/>
@@ -6499,7 +6499,7 @@
         </w:tc>
         <w:tc>
           <w:tcPr>
-            <w:tcW w:w="2525" w:type="dxa"/>
+            <w:tcW w:w="2512" w:type="dxa"/>
             <w:tcBorders>
               <w:left w:val="single" w:sz="2" w:space="0" w:color="BFC7D5"/>
               <w:bottom w:val="single" w:sz="2" w:space="0" w:color="BFC7D5"/>
@@ -6523,7 +6523,7 @@
         </w:tc>
         <w:tc>
           <w:tcPr>
-            <w:tcW w:w="2096" w:type="dxa"/>
+            <w:tcW w:w="2072" w:type="dxa"/>
             <w:tcBorders>
               <w:left w:val="single" w:sz="2" w:space="0" w:color="BFC7D5"/>
               <w:bottom w:val="single" w:sz="2" w:space="0" w:color="BFC7D5"/>
@@ -6547,7 +6547,7 @@
         </w:tc>
         <w:tc>
           <w:tcPr>
-            <w:tcW w:w="5998" w:type="dxa"/>
+            <w:tcW w:w="6037" w:type="dxa"/>
             <w:tcBorders>
               <w:left w:val="single" w:sz="2" w:space="0" w:color="BFC7D5"/>
               <w:bottom w:val="single" w:sz="2" w:space="0" w:color="BFC7D5"/>
@@ -6574,7 +6574,7 @@
         <w:trPr/>
         <w:tc>
           <w:tcPr>
-            <w:tcW w:w="720" w:type="dxa"/>
+            <w:tcW w:w="718" w:type="dxa"/>
             <w:tcBorders>
               <w:left w:val="single" w:sz="6" w:space="0" w:color="BFC7D5"/>
               <w:bottom w:val="single" w:sz="2" w:space="0" w:color="BFC7D5"/>
@@ -6598,7 +6598,7 @@
         </w:tc>
         <w:tc>
           <w:tcPr>
-            <w:tcW w:w="2525" w:type="dxa"/>
+            <w:tcW w:w="2512" w:type="dxa"/>
             <w:tcBorders>
               <w:left w:val="single" w:sz="2" w:space="0" w:color="BFC7D5"/>
               <w:bottom w:val="single" w:sz="2" w:space="0" w:color="BFC7D5"/>
@@ -6622,7 +6622,7 @@
         </w:tc>
         <w:tc>
           <w:tcPr>
-            <w:tcW w:w="2096" w:type="dxa"/>
+            <w:tcW w:w="2072" w:type="dxa"/>
             <w:tcBorders>
               <w:left w:val="single" w:sz="2" w:space="0" w:color="BFC7D5"/>
               <w:bottom w:val="single" w:sz="2" w:space="0" w:color="BFC7D5"/>
@@ -6646,7 +6646,7 @@
         </w:tc>
         <w:tc>
           <w:tcPr>
-            <w:tcW w:w="5998" w:type="dxa"/>
+            <w:tcW w:w="6037" w:type="dxa"/>
             <w:tcBorders>
               <w:left w:val="single" w:sz="2" w:space="0" w:color="BFC7D5"/>
               <w:bottom w:val="single" w:sz="2" w:space="0" w:color="BFC7D5"/>
@@ -6673,7 +6673,7 @@
         <w:trPr/>
         <w:tc>
           <w:tcPr>
-            <w:tcW w:w="720" w:type="dxa"/>
+            <w:tcW w:w="718" w:type="dxa"/>
             <w:tcBorders>
               <w:left w:val="single" w:sz="6" w:space="0" w:color="BFC7D5"/>
               <w:bottom w:val="single" w:sz="2" w:space="0" w:color="BFC7D5"/>
@@ -6697,7 +6697,7 @@
         </w:tc>
         <w:tc>
           <w:tcPr>
-            <w:tcW w:w="2525" w:type="dxa"/>
+            <w:tcW w:w="2512" w:type="dxa"/>
             <w:tcBorders>
               <w:left w:val="single" w:sz="2" w:space="0" w:color="BFC7D5"/>
               <w:bottom w:val="single" w:sz="2" w:space="0" w:color="BFC7D5"/>
@@ -6721,7 +6721,7 @@
         </w:tc>
         <w:tc>
           <w:tcPr>
-            <w:tcW w:w="2096" w:type="dxa"/>
+            <w:tcW w:w="2072" w:type="dxa"/>
             <w:tcBorders>
               <w:left w:val="single" w:sz="2" w:space="0" w:color="BFC7D5"/>
               <w:bottom w:val="single" w:sz="2" w:space="0" w:color="BFC7D5"/>
@@ -6745,7 +6745,7 @@
         </w:tc>
         <w:tc>
           <w:tcPr>
-            <w:tcW w:w="5998" w:type="dxa"/>
+            <w:tcW w:w="6037" w:type="dxa"/>
             <w:tcBorders>
               <w:left w:val="single" w:sz="2" w:space="0" w:color="BFC7D5"/>
               <w:bottom w:val="single" w:sz="2" w:space="0" w:color="BFC7D5"/>
@@ -6772,7 +6772,7 @@
         <w:trPr/>
         <w:tc>
           <w:tcPr>
-            <w:tcW w:w="720" w:type="dxa"/>
+            <w:tcW w:w="718" w:type="dxa"/>
             <w:tcBorders>
               <w:left w:val="single" w:sz="6" w:space="0" w:color="BFC7D5"/>
               <w:bottom w:val="single" w:sz="2" w:space="0" w:color="BFC7D5"/>
@@ -6796,7 +6796,7 @@
         </w:tc>
         <w:tc>
           <w:tcPr>
-            <w:tcW w:w="2525" w:type="dxa"/>
+            <w:tcW w:w="2512" w:type="dxa"/>
             <w:tcBorders>
               <w:left w:val="single" w:sz="2" w:space="0" w:color="BFC7D5"/>
               <w:bottom w:val="single" w:sz="2" w:space="0" w:color="BFC7D5"/>
@@ -6820,7 +6820,7 @@
         </w:tc>
         <w:tc>
           <w:tcPr>
-            <w:tcW w:w="2096" w:type="dxa"/>
+            <w:tcW w:w="2072" w:type="dxa"/>
             <w:tcBorders>
               <w:left w:val="single" w:sz="2" w:space="0" w:color="BFC7D5"/>
               <w:bottom w:val="single" w:sz="2" w:space="0" w:color="BFC7D5"/>
@@ -6844,7 +6844,7 @@
         </w:tc>
         <w:tc>
           <w:tcPr>
-            <w:tcW w:w="5998" w:type="dxa"/>
+            <w:tcW w:w="6037" w:type="dxa"/>
             <w:tcBorders>
               <w:left w:val="single" w:sz="2" w:space="0" w:color="BFC7D5"/>
               <w:bottom w:val="single" w:sz="2" w:space="0" w:color="BFC7D5"/>
@@ -6871,7 +6871,7 @@
         <w:trPr/>
         <w:tc>
           <w:tcPr>
-            <w:tcW w:w="720" w:type="dxa"/>
+            <w:tcW w:w="718" w:type="dxa"/>
             <w:tcBorders>
               <w:left w:val="single" w:sz="6" w:space="0" w:color="BFC7D5"/>
               <w:bottom w:val="single" w:sz="2" w:space="0" w:color="BFC7D5"/>
@@ -6895,7 +6895,7 @@
         </w:tc>
         <w:tc>
           <w:tcPr>
-            <w:tcW w:w="2525" w:type="dxa"/>
+            <w:tcW w:w="2512" w:type="dxa"/>
             <w:tcBorders>
               <w:left w:val="single" w:sz="2" w:space="0" w:color="BFC7D5"/>
               <w:bottom w:val="single" w:sz="2" w:space="0" w:color="BFC7D5"/>
@@ -6919,7 +6919,7 @@
         </w:tc>
         <w:tc>
           <w:tcPr>
-            <w:tcW w:w="2096" w:type="dxa"/>
+            <w:tcW w:w="2072" w:type="dxa"/>
             <w:tcBorders>
               <w:left w:val="single" w:sz="2" w:space="0" w:color="BFC7D5"/>
               <w:bottom w:val="single" w:sz="2" w:space="0" w:color="BFC7D5"/>
@@ -6943,7 +6943,7 @@
         </w:tc>
         <w:tc>
           <w:tcPr>
-            <w:tcW w:w="5998" w:type="dxa"/>
+            <w:tcW w:w="6037" w:type="dxa"/>
             <w:tcBorders>
               <w:left w:val="single" w:sz="2" w:space="0" w:color="BFC7D5"/>
               <w:bottom w:val="single" w:sz="2" w:space="0" w:color="BFC7D5"/>
@@ -6970,7 +6970,7 @@
         <w:trPr/>
         <w:tc>
           <w:tcPr>
-            <w:tcW w:w="720" w:type="dxa"/>
+            <w:tcW w:w="718" w:type="dxa"/>
             <w:tcBorders>
               <w:left w:val="single" w:sz="6" w:space="0" w:color="BFC7D5"/>
               <w:bottom w:val="single" w:sz="2" w:space="0" w:color="BFC7D5"/>
@@ -6994,7 +6994,7 @@
         </w:tc>
         <w:tc>
           <w:tcPr>
-            <w:tcW w:w="2525" w:type="dxa"/>
+            <w:tcW w:w="2512" w:type="dxa"/>
             <w:tcBorders>
               <w:left w:val="single" w:sz="2" w:space="0" w:color="BFC7D5"/>
               <w:bottom w:val="single" w:sz="2" w:space="0" w:color="BFC7D5"/>
@@ -7018,7 +7018,7 @@
         </w:tc>
         <w:tc>
           <w:tcPr>
-            <w:tcW w:w="2096" w:type="dxa"/>
+            <w:tcW w:w="2072" w:type="dxa"/>
             <w:tcBorders>
               <w:left w:val="single" w:sz="2" w:space="0" w:color="BFC7D5"/>
               <w:bottom w:val="single" w:sz="2" w:space="0" w:color="BFC7D5"/>
@@ -7042,7 +7042,7 @@
         </w:tc>
         <w:tc>
           <w:tcPr>
-            <w:tcW w:w="5998" w:type="dxa"/>
+            <w:tcW w:w="6037" w:type="dxa"/>
             <w:tcBorders>
               <w:left w:val="single" w:sz="2" w:space="0" w:color="BFC7D5"/>
               <w:bottom w:val="single" w:sz="2" w:space="0" w:color="BFC7D5"/>
@@ -7069,7 +7069,7 @@
         <w:trPr/>
         <w:tc>
           <w:tcPr>
-            <w:tcW w:w="720" w:type="dxa"/>
+            <w:tcW w:w="718" w:type="dxa"/>
             <w:tcBorders>
               <w:left w:val="single" w:sz="6" w:space="0" w:color="BFC7D5"/>
               <w:bottom w:val="single" w:sz="2" w:space="0" w:color="BFC7D5"/>
@@ -7093,7 +7093,7 @@
         </w:tc>
         <w:tc>
           <w:tcPr>
-            <w:tcW w:w="2525" w:type="dxa"/>
+            <w:tcW w:w="2512" w:type="dxa"/>
             <w:tcBorders>
               <w:left w:val="single" w:sz="2" w:space="0" w:color="BFC7D5"/>
               <w:bottom w:val="single" w:sz="2" w:space="0" w:color="BFC7D5"/>
@@ -7117,7 +7117,7 @@
         </w:tc>
         <w:tc>
           <w:tcPr>
-            <w:tcW w:w="2096" w:type="dxa"/>
+            <w:tcW w:w="2072" w:type="dxa"/>
             <w:tcBorders>
               <w:left w:val="single" w:sz="2" w:space="0" w:color="BFC7D5"/>
               <w:bottom w:val="single" w:sz="2" w:space="0" w:color="BFC7D5"/>
@@ -7141,7 +7141,7 @@
         </w:tc>
         <w:tc>
           <w:tcPr>
-            <w:tcW w:w="5998" w:type="dxa"/>
+            <w:tcW w:w="6037" w:type="dxa"/>
             <w:tcBorders>
               <w:left w:val="single" w:sz="2" w:space="0" w:color="BFC7D5"/>
               <w:bottom w:val="single" w:sz="2" w:space="0" w:color="BFC7D5"/>
@@ -7168,7 +7168,7 @@
         <w:trPr/>
         <w:tc>
           <w:tcPr>
-            <w:tcW w:w="720" w:type="dxa"/>
+            <w:tcW w:w="718" w:type="dxa"/>
             <w:tcBorders>
               <w:left w:val="single" w:sz="6" w:space="0" w:color="BFC7D5"/>
               <w:bottom w:val="single" w:sz="2" w:space="0" w:color="BFC7D5"/>
@@ -7192,7 +7192,7 @@
         </w:tc>
         <w:tc>
           <w:tcPr>
-            <w:tcW w:w="2525" w:type="dxa"/>
+            <w:tcW w:w="2512" w:type="dxa"/>
             <w:tcBorders>
               <w:left w:val="single" w:sz="2" w:space="0" w:color="BFC7D5"/>
               <w:bottom w:val="single" w:sz="2" w:space="0" w:color="BFC7D5"/>
@@ -7216,7 +7216,7 @@
         </w:tc>
         <w:tc>
           <w:tcPr>
-            <w:tcW w:w="2096" w:type="dxa"/>
+            <w:tcW w:w="2072" w:type="dxa"/>
             <w:tcBorders>
               <w:left w:val="single" w:sz="2" w:space="0" w:color="BFC7D5"/>
               <w:bottom w:val="single" w:sz="2" w:space="0" w:color="BFC7D5"/>
@@ -7240,7 +7240,7 @@
         </w:tc>
         <w:tc>
           <w:tcPr>
-            <w:tcW w:w="5998" w:type="dxa"/>
+            <w:tcW w:w="6037" w:type="dxa"/>
             <w:tcBorders>
               <w:left w:val="single" w:sz="2" w:space="0" w:color="BFC7D5"/>
               <w:bottom w:val="single" w:sz="2" w:space="0" w:color="BFC7D5"/>
@@ -7273,7 +7273,7 @@
         <w:trPr/>
         <w:tc>
           <w:tcPr>
-            <w:tcW w:w="720" w:type="dxa"/>
+            <w:tcW w:w="718" w:type="dxa"/>
             <w:tcBorders>
               <w:left w:val="single" w:sz="6" w:space="0" w:color="BFC7D5"/>
               <w:bottom w:val="single" w:sz="2" w:space="0" w:color="BFC7D5"/>
@@ -7297,7 +7297,7 @@
         </w:tc>
         <w:tc>
           <w:tcPr>
-            <w:tcW w:w="2525" w:type="dxa"/>
+            <w:tcW w:w="2512" w:type="dxa"/>
             <w:tcBorders>
               <w:left w:val="single" w:sz="2" w:space="0" w:color="BFC7D5"/>
               <w:bottom w:val="single" w:sz="2" w:space="0" w:color="BFC7D5"/>
@@ -7321,7 +7321,7 @@
         </w:tc>
         <w:tc>
           <w:tcPr>
-            <w:tcW w:w="2096" w:type="dxa"/>
+            <w:tcW w:w="2072" w:type="dxa"/>
             <w:tcBorders>
               <w:left w:val="single" w:sz="2" w:space="0" w:color="BFC7D5"/>
               <w:bottom w:val="single" w:sz="2" w:space="0" w:color="BFC7D5"/>
@@ -7345,7 +7345,7 @@
         </w:tc>
         <w:tc>
           <w:tcPr>
-            <w:tcW w:w="5998" w:type="dxa"/>
+            <w:tcW w:w="6037" w:type="dxa"/>
             <w:tcBorders>
               <w:left w:val="single" w:sz="2" w:space="0" w:color="BFC7D5"/>
               <w:bottom w:val="single" w:sz="2" w:space="0" w:color="BFC7D5"/>
@@ -7372,7 +7372,7 @@
         <w:trPr/>
         <w:tc>
           <w:tcPr>
-            <w:tcW w:w="720" w:type="dxa"/>
+            <w:tcW w:w="718" w:type="dxa"/>
             <w:tcBorders>
               <w:left w:val="single" w:sz="6" w:space="0" w:color="BFC7D5"/>
               <w:bottom w:val="single" w:sz="2" w:space="0" w:color="BFC7D5"/>
@@ -7396,7 +7396,7 @@
         </w:tc>
         <w:tc>
           <w:tcPr>
-            <w:tcW w:w="2525" w:type="dxa"/>
+            <w:tcW w:w="2512" w:type="dxa"/>
             <w:tcBorders>
               <w:left w:val="single" w:sz="2" w:space="0" w:color="BFC7D5"/>
               <w:bottom w:val="single" w:sz="2" w:space="0" w:color="BFC7D5"/>
@@ -7420,7 +7420,7 @@
         </w:tc>
         <w:tc>
           <w:tcPr>
-            <w:tcW w:w="2096" w:type="dxa"/>
+            <w:tcW w:w="2072" w:type="dxa"/>
             <w:tcBorders>
               <w:left w:val="single" w:sz="2" w:space="0" w:color="BFC7D5"/>
               <w:bottom w:val="single" w:sz="2" w:space="0" w:color="BFC7D5"/>
@@ -7444,7 +7444,7 @@
         </w:tc>
         <w:tc>
           <w:tcPr>
-            <w:tcW w:w="5998" w:type="dxa"/>
+            <w:tcW w:w="6037" w:type="dxa"/>
             <w:tcBorders>
               <w:left w:val="single" w:sz="2" w:space="0" w:color="BFC7D5"/>
               <w:bottom w:val="single" w:sz="2" w:space="0" w:color="BFC7D5"/>
@@ -7471,7 +7471,526 @@
         <w:trPr/>
         <w:tc>
           <w:tcPr>
-            <w:tcW w:w="720" w:type="dxa"/>
+            <w:tcW w:w="718" w:type="dxa"/>
+            <w:tcBorders>
+              <w:left w:val="single" w:sz="6" w:space="0" w:color="BFC7D5"/>
+              <w:bottom w:val="single" w:sz="2" w:space="0" w:color="BFC7D5"/>
+              <w:right w:val="single" w:sz="6" w:space="0" w:color="BFC7D5"/>
+            </w:tcBorders>
+            <w:vAlign w:val="center"/>
+          </w:tcPr>
+          <w:p>
+            <w:pPr>
+              <w:pStyle w:val="TableContents"/>
+              <w:bidi w:val="0"/>
+              <w:spacing w:before="0" w:after="283"/>
+              <w:jc w:val="left"/>
+              <w:rPr/>
+            </w:pPr>
+            <w:r>
+              <w:rPr/>
+              <w:t>EM26-22</w:t>
+            </w:r>
+          </w:p>
+        </w:tc>
+        <w:tc>
+          <w:tcPr>
+            <w:tcW w:w="2512" w:type="dxa"/>
+            <w:tcBorders>
+              <w:left w:val="single" w:sz="2" w:space="0" w:color="BFC7D5"/>
+              <w:bottom w:val="single" w:sz="2" w:space="0" w:color="BFC7D5"/>
+              <w:right w:val="single" w:sz="6" w:space="0" w:color="BFC7D5"/>
+            </w:tcBorders>
+            <w:vAlign w:val="center"/>
+          </w:tcPr>
+          <w:p>
+            <w:pPr>
+              <w:pStyle w:val="TableContents"/>
+              <w:bidi w:val="0"/>
+              <w:spacing w:before="0" w:after="283"/>
+              <w:jc w:val="left"/>
+              <w:rPr/>
+            </w:pPr>
+            <w:r>
+              <w:rPr/>
+              <w:t>Product Roadmap 2025 → 2027 (Excel)</w:t>
+            </w:r>
+          </w:p>
+        </w:tc>
+        <w:tc>
+          <w:tcPr>
+            <w:tcW w:w="2072" w:type="dxa"/>
+            <w:tcBorders>
+              <w:left w:val="single" w:sz="2" w:space="0" w:color="BFC7D5"/>
+              <w:bottom w:val="single" w:sz="2" w:space="0" w:color="BFC7D5"/>
+              <w:right w:val="single" w:sz="6" w:space="0" w:color="BFC7D5"/>
+            </w:tcBorders>
+            <w:vAlign w:val="center"/>
+          </w:tcPr>
+          <w:p>
+            <w:pPr>
+              <w:pStyle w:val="TableContents"/>
+              <w:bidi w:val="0"/>
+              <w:spacing w:before="0" w:after="283"/>
+              <w:jc w:val="left"/>
+              <w:rPr/>
+            </w:pPr>
+            <w:r>
+              <w:rPr/>
+              <w:t>EchoMind Project Lead (Alexander Peter)</w:t>
+            </w:r>
+          </w:p>
+        </w:tc>
+        <w:tc>
+          <w:tcPr>
+            <w:tcW w:w="6037" w:type="dxa"/>
+            <w:tcBorders>
+              <w:left w:val="single" w:sz="2" w:space="0" w:color="BFC7D5"/>
+              <w:bottom w:val="single" w:sz="2" w:space="0" w:color="BFC7D5"/>
+              <w:right w:val="single" w:sz="6" w:space="0" w:color="BFC7D5"/>
+            </w:tcBorders>
+            <w:vAlign w:val="center"/>
+          </w:tcPr>
+          <w:p>
+            <w:pPr>
+              <w:pStyle w:val="TableContents"/>
+              <w:bidi w:val="0"/>
+              <w:spacing w:before="0" w:after="283"/>
+              <w:jc w:val="left"/>
+              <w:rPr/>
+            </w:pPr>
+            <w:r>
+              <w:rPr/>
+              <w:t>2025 plan vs actual, 2026 increments, forward plan; rev 1.0 approved 2026-10-12 (AR-2026-003); rev 1.1 (versions v1.0.0–v1.4.1) approved 2026-10-12 (AR-2026-004)</w:t>
+            </w:r>
+          </w:p>
+        </w:tc>
+      </w:tr>
+      <w:tr>
+        <w:trPr/>
+        <w:tc>
+          <w:tcPr>
+            <w:tcW w:w="718" w:type="dxa"/>
+            <w:tcBorders>
+              <w:left w:val="single" w:sz="6" w:space="0" w:color="BFC7D5"/>
+              <w:bottom w:val="single" w:sz="2" w:space="0" w:color="BFC7D5"/>
+              <w:right w:val="single" w:sz="6" w:space="0" w:color="BFC7D5"/>
+            </w:tcBorders>
+            <w:vAlign w:val="center"/>
+          </w:tcPr>
+          <w:p>
+            <w:pPr>
+              <w:pStyle w:val="TableContents"/>
+              <w:bidi w:val="0"/>
+              <w:spacing w:before="0" w:after="283"/>
+              <w:jc w:val="left"/>
+              <w:rPr/>
+            </w:pPr>
+            <w:r>
+              <w:rPr/>
+              <w:t>EM26-23</w:t>
+            </w:r>
+          </w:p>
+        </w:tc>
+        <w:tc>
+          <w:tcPr>
+            <w:tcW w:w="2512" w:type="dxa"/>
+            <w:tcBorders>
+              <w:left w:val="single" w:sz="2" w:space="0" w:color="BFC7D5"/>
+              <w:bottom w:val="single" w:sz="2" w:space="0" w:color="BFC7D5"/>
+              <w:right w:val="single" w:sz="6" w:space="0" w:color="BFC7D5"/>
+            </w:tcBorders>
+            <w:vAlign w:val="center"/>
+          </w:tcPr>
+          <w:p>
+            <w:pPr>
+              <w:pStyle w:val="TableContents"/>
+              <w:bidi w:val="0"/>
+              <w:spacing w:before="0" w:after="283"/>
+              <w:jc w:val="left"/>
+              <w:rPr/>
+            </w:pPr>
+            <w:r>
+              <w:rPr/>
+              <w:t>Project Plan — EchoMind Enterprise</w:t>
+            </w:r>
+          </w:p>
+        </w:tc>
+        <w:tc>
+          <w:tcPr>
+            <w:tcW w:w="2072" w:type="dxa"/>
+            <w:tcBorders>
+              <w:left w:val="single" w:sz="2" w:space="0" w:color="BFC7D5"/>
+              <w:bottom w:val="single" w:sz="2" w:space="0" w:color="BFC7D5"/>
+              <w:right w:val="single" w:sz="6" w:space="0" w:color="BFC7D5"/>
+            </w:tcBorders>
+            <w:vAlign w:val="center"/>
+          </w:tcPr>
+          <w:p>
+            <w:pPr>
+              <w:pStyle w:val="TableContents"/>
+              <w:bidi w:val="0"/>
+              <w:spacing w:before="0" w:after="283"/>
+              <w:jc w:val="left"/>
+              <w:rPr/>
+            </w:pPr>
+            <w:r>
+              <w:rPr/>
+              <w:t>Lead Engineer (Richard Watson Stephen Amudha)</w:t>
+            </w:r>
+          </w:p>
+        </w:tc>
+        <w:tc>
+          <w:tcPr>
+            <w:tcW w:w="6037" w:type="dxa"/>
+            <w:tcBorders>
+              <w:left w:val="single" w:sz="2" w:space="0" w:color="BFC7D5"/>
+              <w:bottom w:val="single" w:sz="2" w:space="0" w:color="BFC7D5"/>
+              <w:right w:val="single" w:sz="6" w:space="0" w:color="BFC7D5"/>
+            </w:tcBorders>
+            <w:vAlign w:val="center"/>
+          </w:tcPr>
+          <w:p>
+            <w:pPr>
+              <w:pStyle w:val="TableContents"/>
+              <w:bidi w:val="0"/>
+              <w:spacing w:before="0" w:after="283"/>
+              <w:jc w:val="left"/>
+              <w:rPr/>
+            </w:pPr>
+            <w:r>
+              <w:rPr/>
+              <w:t xml:space="preserve">1.0 approved 2026-10-13 (AR-2026-005) — </w:t>
+            </w:r>
+            <w:r>
+              <w:rPr>
+                <w:rStyle w:val="SourceText"/>
+              </w:rPr>
+              <w:t>docs/EchoMind_Audit_2026-10-14_Project2/02_Project_Plan/</w:t>
+            </w:r>
+          </w:p>
+        </w:tc>
+      </w:tr>
+      <w:tr>
+        <w:trPr/>
+        <w:tc>
+          <w:tcPr>
+            <w:tcW w:w="718" w:type="dxa"/>
+            <w:tcBorders>
+              <w:left w:val="single" w:sz="6" w:space="0" w:color="BFC7D5"/>
+              <w:bottom w:val="single" w:sz="2" w:space="0" w:color="BFC7D5"/>
+              <w:right w:val="single" w:sz="6" w:space="0" w:color="BFC7D5"/>
+            </w:tcBorders>
+            <w:vAlign w:val="center"/>
+          </w:tcPr>
+          <w:p>
+            <w:pPr>
+              <w:pStyle w:val="TableContents"/>
+              <w:bidi w:val="0"/>
+              <w:spacing w:before="0" w:after="283"/>
+              <w:jc w:val="left"/>
+              <w:rPr/>
+            </w:pPr>
+            <w:r>
+              <w:rPr/>
+              <w:t>EM26-24</w:t>
+            </w:r>
+          </w:p>
+        </w:tc>
+        <w:tc>
+          <w:tcPr>
+            <w:tcW w:w="2512" w:type="dxa"/>
+            <w:tcBorders>
+              <w:left w:val="single" w:sz="2" w:space="0" w:color="BFC7D5"/>
+              <w:bottom w:val="single" w:sz="2" w:space="0" w:color="BFC7D5"/>
+              <w:right w:val="single" w:sz="6" w:space="0" w:color="BFC7D5"/>
+            </w:tcBorders>
+            <w:vAlign w:val="center"/>
+          </w:tcPr>
+          <w:p>
+            <w:pPr>
+              <w:pStyle w:val="TableContents"/>
+              <w:bidi w:val="0"/>
+              <w:spacing w:before="0" w:after="283"/>
+              <w:jc w:val="left"/>
+              <w:rPr/>
+            </w:pPr>
+            <w:r>
+              <w:rPr/>
+              <w:t>Test Plan — EchoMind Enterprise</w:t>
+            </w:r>
+          </w:p>
+        </w:tc>
+        <w:tc>
+          <w:tcPr>
+            <w:tcW w:w="2072" w:type="dxa"/>
+            <w:tcBorders>
+              <w:left w:val="single" w:sz="2" w:space="0" w:color="BFC7D5"/>
+              <w:bottom w:val="single" w:sz="2" w:space="0" w:color="BFC7D5"/>
+              <w:right w:val="single" w:sz="6" w:space="0" w:color="BFC7D5"/>
+            </w:tcBorders>
+            <w:vAlign w:val="center"/>
+          </w:tcPr>
+          <w:p>
+            <w:pPr>
+              <w:pStyle w:val="TableContents"/>
+              <w:bidi w:val="0"/>
+              <w:spacing w:before="0" w:after="283"/>
+              <w:jc w:val="left"/>
+              <w:rPr/>
+            </w:pPr>
+            <w:r>
+              <w:rPr/>
+              <w:t>Lead Engineer (Richard Watson Stephen Amudha)</w:t>
+            </w:r>
+          </w:p>
+        </w:tc>
+        <w:tc>
+          <w:tcPr>
+            <w:tcW w:w="6037" w:type="dxa"/>
+            <w:tcBorders>
+              <w:left w:val="single" w:sz="2" w:space="0" w:color="BFC7D5"/>
+              <w:bottom w:val="single" w:sz="2" w:space="0" w:color="BFC7D5"/>
+              <w:right w:val="single" w:sz="6" w:space="0" w:color="BFC7D5"/>
+            </w:tcBorders>
+            <w:vAlign w:val="center"/>
+          </w:tcPr>
+          <w:p>
+            <w:pPr>
+              <w:pStyle w:val="TableContents"/>
+              <w:bidi w:val="0"/>
+              <w:spacing w:before="0" w:after="283"/>
+              <w:jc w:val="left"/>
+              <w:rPr/>
+            </w:pPr>
+            <w:r>
+              <w:rPr/>
+              <w:t xml:space="preserve">1.0 approved 2026-10-13 (AR-2026-005) — </w:t>
+            </w:r>
+            <w:r>
+              <w:rPr>
+                <w:rStyle w:val="SourceText"/>
+              </w:rPr>
+              <w:t>…/08_Test_Plan_and_Test_Cases/</w:t>
+            </w:r>
+          </w:p>
+        </w:tc>
+      </w:tr>
+      <w:tr>
+        <w:trPr/>
+        <w:tc>
+          <w:tcPr>
+            <w:tcW w:w="718" w:type="dxa"/>
+            <w:tcBorders>
+              <w:left w:val="single" w:sz="6" w:space="0" w:color="BFC7D5"/>
+              <w:bottom w:val="single" w:sz="2" w:space="0" w:color="BFC7D5"/>
+              <w:right w:val="single" w:sz="6" w:space="0" w:color="BFC7D5"/>
+            </w:tcBorders>
+            <w:vAlign w:val="center"/>
+          </w:tcPr>
+          <w:p>
+            <w:pPr>
+              <w:pStyle w:val="TableContents"/>
+              <w:bidi w:val="0"/>
+              <w:spacing w:before="0" w:after="283"/>
+              <w:jc w:val="left"/>
+              <w:rPr/>
+            </w:pPr>
+            <w:r>
+              <w:rPr/>
+              <w:t>EM26-25</w:t>
+            </w:r>
+          </w:p>
+        </w:tc>
+        <w:tc>
+          <w:tcPr>
+            <w:tcW w:w="2512" w:type="dxa"/>
+            <w:tcBorders>
+              <w:left w:val="single" w:sz="2" w:space="0" w:color="BFC7D5"/>
+              <w:bottom w:val="single" w:sz="2" w:space="0" w:color="BFC7D5"/>
+              <w:right w:val="single" w:sz="6" w:space="0" w:color="BFC7D5"/>
+            </w:tcBorders>
+            <w:vAlign w:val="center"/>
+          </w:tcPr>
+          <w:p>
+            <w:pPr>
+              <w:pStyle w:val="TableContents"/>
+              <w:bidi w:val="0"/>
+              <w:spacing w:before="0" w:after="283"/>
+              <w:jc w:val="left"/>
+              <w:rPr/>
+            </w:pPr>
+            <w:r>
+              <w:rPr/>
+              <w:t>Release Notes v1.0.0 → v1.4.1</w:t>
+            </w:r>
+          </w:p>
+        </w:tc>
+        <w:tc>
+          <w:tcPr>
+            <w:tcW w:w="2072" w:type="dxa"/>
+            <w:tcBorders>
+              <w:left w:val="single" w:sz="2" w:space="0" w:color="BFC7D5"/>
+              <w:bottom w:val="single" w:sz="2" w:space="0" w:color="BFC7D5"/>
+              <w:right w:val="single" w:sz="6" w:space="0" w:color="BFC7D5"/>
+            </w:tcBorders>
+            <w:vAlign w:val="center"/>
+          </w:tcPr>
+          <w:p>
+            <w:pPr>
+              <w:pStyle w:val="TableContents"/>
+              <w:bidi w:val="0"/>
+              <w:spacing w:before="0" w:after="283"/>
+              <w:jc w:val="left"/>
+              <w:rPr/>
+            </w:pPr>
+            <w:r>
+              <w:rPr/>
+              <w:t>Lead Engineer (Richard Watson Stephen Amudha)</w:t>
+            </w:r>
+          </w:p>
+        </w:tc>
+        <w:tc>
+          <w:tcPr>
+            <w:tcW w:w="6037" w:type="dxa"/>
+            <w:tcBorders>
+              <w:left w:val="single" w:sz="2" w:space="0" w:color="BFC7D5"/>
+              <w:bottom w:val="single" w:sz="2" w:space="0" w:color="BFC7D5"/>
+              <w:right w:val="single" w:sz="6" w:space="0" w:color="BFC7D5"/>
+            </w:tcBorders>
+            <w:vAlign w:val="center"/>
+          </w:tcPr>
+          <w:p>
+            <w:pPr>
+              <w:pStyle w:val="TableContents"/>
+              <w:bidi w:val="0"/>
+              <w:spacing w:before="0" w:after="283"/>
+              <w:jc w:val="left"/>
+              <w:rPr/>
+            </w:pPr>
+            <w:r>
+              <w:rPr/>
+              <w:t xml:space="preserve">1.0 approved 2026-10-13 (AR-2026-005) — </w:t>
+            </w:r>
+            <w:r>
+              <w:rPr>
+                <w:rStyle w:val="SourceText"/>
+              </w:rPr>
+              <w:t>…/11_Release_Notes/</w:t>
+            </w:r>
+          </w:p>
+        </w:tc>
+      </w:tr>
+      <w:tr>
+        <w:trPr/>
+        <w:tc>
+          <w:tcPr>
+            <w:tcW w:w="718" w:type="dxa"/>
+            <w:tcBorders>
+              <w:left w:val="single" w:sz="6" w:space="0" w:color="BFC7D5"/>
+              <w:bottom w:val="single" w:sz="2" w:space="0" w:color="BFC7D5"/>
+              <w:right w:val="single" w:sz="6" w:space="0" w:color="BFC7D5"/>
+            </w:tcBorders>
+            <w:vAlign w:val="center"/>
+          </w:tcPr>
+          <w:p>
+            <w:pPr>
+              <w:pStyle w:val="TableContents"/>
+              <w:bidi w:val="0"/>
+              <w:spacing w:before="0" w:after="283"/>
+              <w:jc w:val="left"/>
+              <w:rPr/>
+            </w:pPr>
+            <w:r>
+              <w:rPr/>
+              <w:t>EM26-26</w:t>
+            </w:r>
+          </w:p>
+        </w:tc>
+        <w:tc>
+          <w:tcPr>
+            <w:tcW w:w="2512" w:type="dxa"/>
+            <w:tcBorders>
+              <w:left w:val="single" w:sz="2" w:space="0" w:color="BFC7D5"/>
+              <w:bottom w:val="single" w:sz="2" w:space="0" w:color="BFC7D5"/>
+              <w:right w:val="single" w:sz="6" w:space="0" w:color="BFC7D5"/>
+            </w:tcBorders>
+            <w:vAlign w:val="center"/>
+          </w:tcPr>
+          <w:p>
+            <w:pPr>
+              <w:pStyle w:val="TableContents"/>
+              <w:bidi w:val="0"/>
+              <w:spacing w:before="0" w:after="283"/>
+              <w:jc w:val="left"/>
+              <w:rPr/>
+            </w:pPr>
+            <w:r>
+              <w:rPr/>
+              <w:t>New Use Cases — EchoMind Enterprise</w:t>
+            </w:r>
+          </w:p>
+        </w:tc>
+        <w:tc>
+          <w:tcPr>
+            <w:tcW w:w="2072" w:type="dxa"/>
+            <w:tcBorders>
+              <w:left w:val="single" w:sz="2" w:space="0" w:color="BFC7D5"/>
+              <w:bottom w:val="single" w:sz="2" w:space="0" w:color="BFC7D5"/>
+              <w:right w:val="single" w:sz="6" w:space="0" w:color="BFC7D5"/>
+            </w:tcBorders>
+            <w:vAlign w:val="center"/>
+          </w:tcPr>
+          <w:p>
+            <w:pPr>
+              <w:pStyle w:val="TableContents"/>
+              <w:bidi w:val="0"/>
+              <w:spacing w:before="0" w:after="283"/>
+              <w:jc w:val="left"/>
+              <w:rPr/>
+            </w:pPr>
+            <w:r>
+              <w:rPr/>
+              <w:t>EchoMind Project Lead (Alexander Peter)</w:t>
+            </w:r>
+          </w:p>
+        </w:tc>
+        <w:tc>
+          <w:tcPr>
+            <w:tcW w:w="6037" w:type="dxa"/>
+            <w:tcBorders>
+              <w:left w:val="single" w:sz="2" w:space="0" w:color="BFC7D5"/>
+              <w:bottom w:val="single" w:sz="2" w:space="0" w:color="BFC7D5"/>
+              <w:right w:val="single" w:sz="6" w:space="0" w:color="BFC7D5"/>
+            </w:tcBorders>
+            <w:vAlign w:val="center"/>
+          </w:tcPr>
+          <w:p>
+            <w:pPr>
+              <w:pStyle w:val="TableContents"/>
+              <w:bidi w:val="0"/>
+              <w:spacing w:before="0" w:after="283"/>
+              <w:jc w:val="left"/>
+              <w:rPr/>
+            </w:pPr>
+            <w:r>
+              <w:rPr/>
+              <w:t xml:space="preserve">1.0 approved 2026-10-13 (AR-2026-005) — </w:t>
+            </w:r>
+            <w:r>
+              <w:rPr>
+                <w:rStyle w:val="SourceText"/>
+              </w:rPr>
+              <w:t>…/13_New_Use_Case_EchoMind/</w:t>
+            </w:r>
+          </w:p>
+        </w:tc>
+      </w:tr>
+      <w:tr>
+        <w:trPr/>
+        <w:tc>
+          <w:tcPr>
+            <w:tcW w:w="718" w:type="dxa"/>
             <w:tcBorders>
               <w:left w:val="single" w:sz="6" w:space="0" w:color="BFC7D5"/>
               <w:bottom w:val="single" w:sz="6" w:space="0" w:color="BFC7D5"/>
@@ -7489,13 +8008,13 @@
             </w:pPr>
             <w:r>
               <w:rPr/>
-              <w:t>EM26-22</w:t>
-            </w:r>
-          </w:p>
-        </w:tc>
-        <w:tc>
-          <w:tcPr>
-            <w:tcW w:w="2525" w:type="dxa"/>
+              <w:t>EM26-27</w:t>
+            </w:r>
+          </w:p>
+        </w:tc>
+        <w:tc>
+          <w:tcPr>
+            <w:tcW w:w="2512" w:type="dxa"/>
             <w:tcBorders>
               <w:left w:val="single" w:sz="2" w:space="0" w:color="BFC7D5"/>
               <w:bottom w:val="single" w:sz="6" w:space="0" w:color="BFC7D5"/>
@@ -7513,13 +8032,13 @@
             </w:pPr>
             <w:r>
               <w:rPr/>
-              <w:t>Product Roadmap 2025 → 2027 (Excel)</w:t>
-            </w:r>
-          </w:p>
-        </w:tc>
-        <w:tc>
-          <w:tcPr>
-            <w:tcW w:w="2096" w:type="dxa"/>
+              <w:t>Client Communication Log</w:t>
+            </w:r>
+          </w:p>
+        </w:tc>
+        <w:tc>
+          <w:tcPr>
+            <w:tcW w:w="2072" w:type="dxa"/>
             <w:tcBorders>
               <w:left w:val="single" w:sz="2" w:space="0" w:color="BFC7D5"/>
               <w:bottom w:val="single" w:sz="6" w:space="0" w:color="BFC7D5"/>
@@ -7543,7 +8062,7 @@
         </w:tc>
         <w:tc>
           <w:tcPr>
-            <w:tcW w:w="5998" w:type="dxa"/>
+            <w:tcW w:w="6037" w:type="dxa"/>
             <w:tcBorders>
               <w:left w:val="single" w:sz="2" w:space="0" w:color="BFC7D5"/>
               <w:bottom w:val="single" w:sz="6" w:space="0" w:color="BFC7D5"/>
@@ -7561,7 +8080,13 @@
             </w:pPr>
             <w:r>
               <w:rPr/>
-              <w:t>2025 plan vs actual, 2026 increments, forward plan; rev 1.0 approved 2026-10-12 (AR-2026-003); rev 1.1 (versions v1.0.0–v1.4.1) approved 2026-10-12 (AR-2026-004)</w:t>
+              <w:t xml:space="preserve">1.0 approved 2026-10-13 (AR-2026-005) — </w:t>
+            </w:r>
+            <w:r>
+              <w:rPr>
+                <w:rStyle w:val="SourceText"/>
+              </w:rPr>
+              <w:t>…/03_Communication_with_Client/</w:t>
             </w:r>
           </w:p>
         </w:tc>
@@ -8196,7 +8721,7 @@
       </w:r>
       <w:r>
         <w:rPr/>
-        <w:t xml:space="preserve"> (AR-2026-001 … AR-2026-004), </w:t>
+        <w:t xml:space="preserve"> (AR-2026-001 … AR-2026-005), </w:t>
       </w:r>
       <w:r>
         <w:rPr>

</xml_diff>